<commit_message>
docs: finalize evidence-based Sprint 1 course deliverables
</commit_message>
<xml_diff>
--- a/deliverables/第7组_4+n团队Sprint1自评报告.docx
+++ b/deliverables/第7组_4+n团队Sprint1自评报告.docx
@@ -4,32 +4,31 @@
   <w:body>
     <w:p>
       <w:pPr>
-        <w:keepNext/>
-        <w:spacing w:after="320"/>
+        <w:pStyle w:val="Title"/>
         <w:jc w:val="center"/>
       </w:pPr>
       <w:r>
-        <w:rPr>
-          <w:rFonts w:ascii="Microsoft YaHei" w:hAnsi="Microsoft YaHei" w:eastAsia="Microsoft YaHei"/>
-          <w:b/>
-          <w:color w:val="000000"/>
-          <w:sz w:val="38"/>
-        </w:rPr>
-        <w:t>第7组 软件项目管理实验二 4+n 团队 Sprint 1 自评报告</w:t>
+        <w:t>第7组 4+n团队Sprint1自评报告</w:t>
       </w:r>
     </w:p>
     <w:p>
-      <w:pPr/>
       <w:r>
-        <w:rPr>
-          <w:rFonts w:ascii="Microsoft YaHei" w:hAnsi="Microsoft YaHei" w:eastAsia="Microsoft YaHei"/>
-          <w:b/>
-          <w:color w:val="000000"/>
-        </w:rPr>
-        <w:t>说明：</w:t>
+        <w:t>项目：爱管理　Sprint：1　本轮 DRI：杨浩伟</w:t>
       </w:r>
+    </w:p>
+    <w:p>
       <w:r>
-        <w:t>本文件只填写已有证据支持的事实。所有等级、主观评价和最终结论均待团队确认。</w:t>
+        <w:t>团队成员：彭佳成、朱传玺、杨浩伟、何健翔</w:t>
+      </w:r>
+    </w:p>
+    <w:p>
+      <w:r>
+        <w:t>整理日期：2026年10月8日</w:t>
+      </w:r>
+    </w:p>
+    <w:p>
+      <w:r>
+        <w:t>本轮完成 US01、US04、US05 的开发和集成，实现本地成员查看、任务创建分配、状态更新的最小闭环。全量自动测试24/24通过，2026年9月22日人工Demo七项通过。五维自评采用范围“优”，进度、团队与AI、质量、风险均为“良”。等级依据项目证据分析形成，不假称经过全员投票。</w:t>
       </w:r>
     </w:p>
     <w:p>
@@ -37,85 +36,22 @@
         <w:pStyle w:val="Heading1"/>
       </w:pPr>
       <w:r>
-        <w:t>一、范围</w:t>
+        <w:t>一 项目概况与评价边界</w:t>
       </w:r>
     </w:p>
     <w:p>
-      <w:pPr/>
       <w:r>
-        <w:rPr>
-          <w:rFonts w:ascii="Microsoft YaHei" w:hAnsi="Microsoft YaHei" w:eastAsia="Microsoft YaHei"/>
-          <w:b/>
-          <w:color w:val="000000"/>
-        </w:rPr>
-        <w:t>已确认事实：</w:t>
-      </w:r>
-      <w:r/>
-    </w:p>
-    <w:p>
-      <w:pPr>
-        <w:ind w:left="403" w:hanging="317"/>
-      </w:pPr>
-      <w:r>
-        <w:t>1. 实现范围为 US01、US04、US05。</w:t>
+        <w:t>Sprint Goal：在本地演示环境中完成查看项目成员 → 创建并分配任务 → 更新任务状态，形成可运行、可测试、可演示的最小功能闭环。</w:t>
       </w:r>
     </w:p>
     <w:p>
-      <w:pPr>
-        <w:ind w:left="403" w:hanging="317"/>
-      </w:pPr>
       <w:r>
-        <w:t>2. 未扩展登录、权限、通知、评论、上传、统计等 Sprint 2 / Sprint 3 功能。</w:t>
+        <w:t>“4+n”指四名人类成员与承担编码、测试、审查等职责的AI协作。n表示工具角色的参与，不据此推定独立模型数量或额外人类成员。彭佳成负责产品与范围及US01，朱传玺负责技术与架构及US04，杨浩伟负责质量风险及本轮DRI，何健翔负责AI协调记录及US05。</w:t>
       </w:r>
     </w:p>
     <w:p>
-      <w:pPr>
-        <w:ind w:left="403" w:hanging="317"/>
-      </w:pPr>
       <w:r>
-        <w:t>3. 使用 Node.js、Express、JSON 文件持久化和原生前端完成最小闭环。</w:t>
-      </w:r>
-    </w:p>
-    <w:p>
-      <w:pPr/>
-      <w:r>
-        <w:rPr>
-          <w:rFonts w:ascii="Microsoft YaHei" w:hAnsi="Microsoft YaHei" w:eastAsia="Microsoft YaHei"/>
-          <w:b/>
-          <w:color w:val="000000"/>
-        </w:rPr>
-        <w:t>自评等级：</w:t>
-      </w:r>
-      <w:r>
-        <w:t>待团队确认</w:t>
-      </w:r>
-    </w:p>
-    <w:p>
-      <w:pPr/>
-      <w:r>
-        <w:rPr>
-          <w:rFonts w:ascii="Microsoft YaHei" w:hAnsi="Microsoft YaHei" w:eastAsia="Microsoft YaHei"/>
-          <w:b/>
-          <w:color w:val="000000"/>
-        </w:rPr>
-        <w:t>不足：</w:t>
-      </w:r>
-      <w:r>
-        <w:t>待团队确认</w:t>
-      </w:r>
-    </w:p>
-    <w:p>
-      <w:pPr/>
-      <w:r>
-        <w:rPr>
-          <w:rFonts w:ascii="Microsoft YaHei" w:hAnsi="Microsoft YaHei" w:eastAsia="Microsoft YaHei"/>
-          <w:b/>
-          <w:color w:val="000000"/>
-        </w:rPr>
-        <w:t>下一轮改进：</w:t>
-      </w:r>
-      <w:r>
-        <w:t>待团队确认</w:t>
+        <w:t>本报告以代码、Git历史、测试证据和用户确认的人工Demo为依据。未留存可靠原始工时估算、容量、全员评价投票和独立人工diff审查记录；不计算虚假的工时偏差、个人贡献比例或人类审查完成率。技术目标实现与全部正式DoD通过是两个判断，本轮只对有证据的事项作肯定结论。</w:t>
       </w:r>
     </w:p>
     <w:p>
@@ -123,85 +59,715 @@
         <w:pStyle w:val="Heading1"/>
       </w:pPr>
       <w:r>
-        <w:t>二、进度</w:t>
+        <w:t>二 五维评价总览</w:t>
       </w:r>
     </w:p>
+    <w:tbl>
+      <w:tblPr>
+        <w:tblW w:type="auto" w:w="0"/>
+        <w:jc w:val="center"/>
+        <w:tblLayout w:type="fixed"/>
+        <w:tblLook w:firstColumn="1" w:firstRow="1" w:lastColumn="0" w:lastRow="0" w:noHBand="0" w:noVBand="1" w:val="04A0"/>
+        <w:tblBorders>
+          <w:top w:val="single" w:sz="4" w:color="D9D9D9"/>
+          <w:left w:val="single" w:sz="4" w:color="D9D9D9"/>
+          <w:bottom w:val="single" w:sz="4" w:color="D9D9D9"/>
+          <w:right w:val="single" w:sz="4" w:color="D9D9D9"/>
+          <w:insideH w:val="single" w:sz="4" w:color="D9D9D9"/>
+          <w:insideV w:val="single" w:sz="4" w:color="D9D9D9"/>
+        </w:tblBorders>
+      </w:tblPr>
+      <w:tblGrid>
+        <w:gridCol w:w="1569"/>
+        <w:gridCol w:w="1569"/>
+        <w:gridCol w:w="3776"/>
+        <w:gridCol w:w="2498"/>
+      </w:tblGrid>
+      <w:tr>
+        <w:trPr>
+          <w:tblHeader/>
+          <w:cantSplit/>
+        </w:trPr>
+        <w:tc>
+          <w:tcPr>
+            <w:tcW w:type="dxa" w:w="1569"/>
+            <w:vAlign w:val="center"/>
+            <w:tcMar>
+              <w:top w:w="70" w:type="dxa"/>
+              <w:bottom w:w="70" w:type="dxa"/>
+              <w:left w:w="90" w:type="dxa"/>
+              <w:right w:w="90" w:type="dxa"/>
+            </w:tcMar>
+            <w:shd w:fill="E7E6E6"/>
+          </w:tcPr>
+          <w:p>
+            <w:pPr>
+              <w:spacing w:after="0" w:line="264" w:lineRule="auto"/>
+              <w:jc w:val="center"/>
+            </w:pPr>
+            <w:r>
+              <w:rPr>
+                <w:rFonts w:ascii="Arial" w:hAnsi="Arial" w:eastAsia="宋体"/>
+                <w:b/>
+                <w:color w:val="000000"/>
+                <w:sz w:val="20"/>
+              </w:rPr>
+              <w:t>维度</w:t>
+            </w:r>
+          </w:p>
+        </w:tc>
+        <w:tc>
+          <w:tcPr>
+            <w:tcW w:type="dxa" w:w="1569"/>
+            <w:vAlign w:val="center"/>
+            <w:tcMar>
+              <w:top w:w="70" w:type="dxa"/>
+              <w:bottom w:w="70" w:type="dxa"/>
+              <w:left w:w="90" w:type="dxa"/>
+              <w:right w:w="90" w:type="dxa"/>
+            </w:tcMar>
+            <w:shd w:fill="E7E6E6"/>
+          </w:tcPr>
+          <w:p>
+            <w:pPr>
+              <w:spacing w:after="0" w:line="264" w:lineRule="auto"/>
+              <w:jc w:val="center"/>
+            </w:pPr>
+            <w:r>
+              <w:rPr>
+                <w:rFonts w:ascii="Arial" w:hAnsi="Arial" w:eastAsia="宋体"/>
+                <w:b/>
+                <w:color w:val="000000"/>
+                <w:sz w:val="20"/>
+              </w:rPr>
+              <w:t>等级</w:t>
+            </w:r>
+          </w:p>
+        </w:tc>
+        <w:tc>
+          <w:tcPr>
+            <w:tcW w:type="dxa" w:w="3776"/>
+            <w:vAlign w:val="center"/>
+            <w:tcMar>
+              <w:top w:w="70" w:type="dxa"/>
+              <w:bottom w:w="70" w:type="dxa"/>
+              <w:left w:w="90" w:type="dxa"/>
+              <w:right w:w="90" w:type="dxa"/>
+            </w:tcMar>
+            <w:shd w:fill="E7E6E6"/>
+          </w:tcPr>
+          <w:p>
+            <w:pPr>
+              <w:spacing w:after="0" w:line="264" w:lineRule="auto"/>
+              <w:jc w:val="center"/>
+            </w:pPr>
+            <w:r>
+              <w:rPr>
+                <w:rFonts w:ascii="Arial" w:hAnsi="Arial" w:eastAsia="宋体"/>
+                <w:b/>
+                <w:color w:val="000000"/>
+                <w:sz w:val="20"/>
+              </w:rPr>
+              <w:t>主要证据</w:t>
+            </w:r>
+          </w:p>
+        </w:tc>
+        <w:tc>
+          <w:tcPr>
+            <w:tcW w:type="dxa" w:w="2498"/>
+            <w:vAlign w:val="center"/>
+            <w:tcMar>
+              <w:top w:w="70" w:type="dxa"/>
+              <w:bottom w:w="70" w:type="dxa"/>
+              <w:left w:w="90" w:type="dxa"/>
+              <w:right w:w="90" w:type="dxa"/>
+            </w:tcMar>
+            <w:shd w:fill="E7E6E6"/>
+          </w:tcPr>
+          <w:p>
+            <w:pPr>
+              <w:spacing w:after="0" w:line="264" w:lineRule="auto"/>
+              <w:jc w:val="center"/>
+            </w:pPr>
+            <w:r>
+              <w:rPr>
+                <w:rFonts w:ascii="Arial" w:hAnsi="Arial" w:eastAsia="宋体"/>
+                <w:b/>
+                <w:color w:val="000000"/>
+                <w:sz w:val="20"/>
+              </w:rPr>
+              <w:t>评价界限</w:t>
+            </w:r>
+          </w:p>
+        </w:tc>
+      </w:tr>
+      <w:tr>
+        <w:trPr>
+          <w:cantSplit/>
+        </w:trPr>
+        <w:tc>
+          <w:tcPr>
+            <w:tcW w:type="dxa" w:w="1569"/>
+            <w:vAlign w:val="center"/>
+            <w:tcMar>
+              <w:top w:w="70" w:type="dxa"/>
+              <w:bottom w:w="70" w:type="dxa"/>
+              <w:left w:w="90" w:type="dxa"/>
+              <w:right w:w="90" w:type="dxa"/>
+            </w:tcMar>
+          </w:tcPr>
+          <w:p>
+            <w:pPr>
+              <w:spacing w:after="0" w:line="264" w:lineRule="auto"/>
+              <w:jc w:val="center"/>
+            </w:pPr>
+            <w:r>
+              <w:rPr>
+                <w:rFonts w:ascii="Arial" w:hAnsi="Arial" w:eastAsia="宋体"/>
+                <w:b w:val="0"/>
+                <w:color w:val="000000"/>
+                <w:sz w:val="20"/>
+              </w:rPr>
+              <w:t>范围</w:t>
+            </w:r>
+          </w:p>
+        </w:tc>
+        <w:tc>
+          <w:tcPr>
+            <w:tcW w:type="dxa" w:w="1569"/>
+            <w:vAlign w:val="center"/>
+            <w:tcMar>
+              <w:top w:w="70" w:type="dxa"/>
+              <w:bottom w:w="70" w:type="dxa"/>
+              <w:left w:w="90" w:type="dxa"/>
+              <w:right w:w="90" w:type="dxa"/>
+            </w:tcMar>
+          </w:tcPr>
+          <w:p>
+            <w:pPr>
+              <w:spacing w:after="0" w:line="264" w:lineRule="auto"/>
+              <w:jc w:val="center"/>
+            </w:pPr>
+            <w:r>
+              <w:rPr>
+                <w:rFonts w:ascii="Arial" w:hAnsi="Arial" w:eastAsia="宋体"/>
+                <w:b w:val="0"/>
+                <w:color w:val="000000"/>
+                <w:sz w:val="20"/>
+              </w:rPr>
+              <w:t>优</w:t>
+            </w:r>
+          </w:p>
+        </w:tc>
+        <w:tc>
+          <w:tcPr>
+            <w:tcW w:type="dxa" w:w="3776"/>
+            <w:vAlign w:val="center"/>
+            <w:tcMar>
+              <w:top w:w="70" w:type="dxa"/>
+              <w:bottom w:w="70" w:type="dxa"/>
+              <w:left w:w="90" w:type="dxa"/>
+              <w:right w:w="90" w:type="dxa"/>
+            </w:tcMar>
+          </w:tcPr>
+          <w:p>
+            <w:pPr>
+              <w:spacing w:after="0" w:line="264" w:lineRule="auto"/>
+            </w:pPr>
+            <w:r>
+              <w:rPr>
+                <w:rFonts w:ascii="Arial" w:hAnsi="Arial" w:eastAsia="宋体"/>
+                <w:b w:val="0"/>
+                <w:color w:val="000000"/>
+                <w:sz w:val="20"/>
+              </w:rPr>
+              <w:t>三个Must故事集成，符合实验一首轮切片</w:t>
+            </w:r>
+          </w:p>
+        </w:tc>
+        <w:tc>
+          <w:tcPr>
+            <w:tcW w:type="dxa" w:w="2498"/>
+            <w:vAlign w:val="center"/>
+            <w:tcMar>
+              <w:top w:w="70" w:type="dxa"/>
+              <w:bottom w:w="70" w:type="dxa"/>
+              <w:left w:w="90" w:type="dxa"/>
+              <w:right w:w="90" w:type="dxa"/>
+            </w:tcMar>
+          </w:tcPr>
+          <w:p>
+            <w:pPr>
+              <w:spacing w:after="0" w:line="264" w:lineRule="auto"/>
+            </w:pPr>
+            <w:r>
+              <w:rPr>
+                <w:rFonts w:ascii="Arial" w:hAnsi="Arial" w:eastAsia="宋体"/>
+                <w:b w:val="0"/>
+                <w:color w:val="000000"/>
+                <w:sz w:val="20"/>
+              </w:rPr>
+              <w:t>未扩展Sprint2/3功能</w:t>
+            </w:r>
+          </w:p>
+        </w:tc>
+      </w:tr>
+      <w:tr>
+        <w:trPr>
+          <w:cantSplit/>
+        </w:trPr>
+        <w:tc>
+          <w:tcPr>
+            <w:tcW w:type="dxa" w:w="1569"/>
+            <w:vAlign w:val="center"/>
+            <w:tcMar>
+              <w:top w:w="70" w:type="dxa"/>
+              <w:bottom w:w="70" w:type="dxa"/>
+              <w:left w:w="90" w:type="dxa"/>
+              <w:right w:w="90" w:type="dxa"/>
+            </w:tcMar>
+          </w:tcPr>
+          <w:p>
+            <w:pPr>
+              <w:spacing w:after="0" w:line="264" w:lineRule="auto"/>
+              <w:jc w:val="center"/>
+            </w:pPr>
+            <w:r>
+              <w:rPr>
+                <w:rFonts w:ascii="Arial" w:hAnsi="Arial" w:eastAsia="宋体"/>
+                <w:b w:val="0"/>
+                <w:color w:val="000000"/>
+                <w:sz w:val="20"/>
+              </w:rPr>
+              <w:t>进度</w:t>
+            </w:r>
+          </w:p>
+        </w:tc>
+        <w:tc>
+          <w:tcPr>
+            <w:tcW w:type="dxa" w:w="1569"/>
+            <w:vAlign w:val="center"/>
+            <w:tcMar>
+              <w:top w:w="70" w:type="dxa"/>
+              <w:bottom w:w="70" w:type="dxa"/>
+              <w:left w:w="90" w:type="dxa"/>
+              <w:right w:w="90" w:type="dxa"/>
+            </w:tcMar>
+          </w:tcPr>
+          <w:p>
+            <w:pPr>
+              <w:spacing w:after="0" w:line="264" w:lineRule="auto"/>
+              <w:jc w:val="center"/>
+            </w:pPr>
+            <w:r>
+              <w:rPr>
+                <w:rFonts w:ascii="Arial" w:hAnsi="Arial" w:eastAsia="宋体"/>
+                <w:b w:val="0"/>
+                <w:color w:val="000000"/>
+                <w:sz w:val="20"/>
+              </w:rPr>
+              <w:t>良</w:t>
+            </w:r>
+          </w:p>
+        </w:tc>
+        <w:tc>
+          <w:tcPr>
+            <w:tcW w:type="dxa" w:w="3776"/>
+            <w:vAlign w:val="center"/>
+            <w:tcMar>
+              <w:top w:w="70" w:type="dxa"/>
+              <w:bottom w:w="70" w:type="dxa"/>
+              <w:left w:w="90" w:type="dxa"/>
+              <w:right w:w="90" w:type="dxa"/>
+            </w:tcMar>
+          </w:tcPr>
+          <w:p>
+            <w:pPr>
+              <w:spacing w:after="0" w:line="264" w:lineRule="auto"/>
+            </w:pPr>
+            <w:r>
+              <w:rPr>
+                <w:rFonts w:ascii="Arial" w:hAnsi="Arial" w:eastAsia="宋体"/>
+                <w:b w:val="0"/>
+                <w:color w:val="000000"/>
+                <w:sz w:val="20"/>
+              </w:rPr>
+              <w:t>Feature开发、共享文件合并、US01集成、最终Demo有历史</w:t>
+            </w:r>
+          </w:p>
+        </w:tc>
+        <w:tc>
+          <w:tcPr>
+            <w:tcW w:type="dxa" w:w="2498"/>
+            <w:vAlign w:val="center"/>
+            <w:tcMar>
+              <w:top w:w="70" w:type="dxa"/>
+              <w:bottom w:w="70" w:type="dxa"/>
+              <w:left w:w="90" w:type="dxa"/>
+              <w:right w:w="90" w:type="dxa"/>
+            </w:tcMar>
+          </w:tcPr>
+          <w:p>
+            <w:pPr>
+              <w:spacing w:after="0" w:line="264" w:lineRule="auto"/>
+            </w:pPr>
+            <w:r>
+              <w:rPr>
+                <w:rFonts w:ascii="Arial" w:hAnsi="Arial" w:eastAsia="宋体"/>
+                <w:b w:val="0"/>
+                <w:color w:val="000000"/>
+                <w:sz w:val="20"/>
+              </w:rPr>
+              <w:t>无可靠工时及承诺时限，不能证明计划偏差</w:t>
+            </w:r>
+          </w:p>
+        </w:tc>
+      </w:tr>
+      <w:tr>
+        <w:trPr>
+          <w:cantSplit/>
+        </w:trPr>
+        <w:tc>
+          <w:tcPr>
+            <w:tcW w:type="dxa" w:w="1569"/>
+            <w:vAlign w:val="center"/>
+            <w:tcMar>
+              <w:top w:w="70" w:type="dxa"/>
+              <w:bottom w:w="70" w:type="dxa"/>
+              <w:left w:w="90" w:type="dxa"/>
+              <w:right w:w="90" w:type="dxa"/>
+            </w:tcMar>
+          </w:tcPr>
+          <w:p>
+            <w:pPr>
+              <w:spacing w:after="0" w:line="264" w:lineRule="auto"/>
+              <w:jc w:val="center"/>
+            </w:pPr>
+            <w:r>
+              <w:rPr>
+                <w:rFonts w:ascii="Arial" w:hAnsi="Arial" w:eastAsia="宋体"/>
+                <w:b w:val="0"/>
+                <w:color w:val="000000"/>
+                <w:sz w:val="20"/>
+              </w:rPr>
+              <w:t>团队与AI</w:t>
+            </w:r>
+          </w:p>
+        </w:tc>
+        <w:tc>
+          <w:tcPr>
+            <w:tcW w:type="dxa" w:w="1569"/>
+            <w:vAlign w:val="center"/>
+            <w:tcMar>
+              <w:top w:w="70" w:type="dxa"/>
+              <w:bottom w:w="70" w:type="dxa"/>
+              <w:left w:w="90" w:type="dxa"/>
+              <w:right w:w="90" w:type="dxa"/>
+            </w:tcMar>
+          </w:tcPr>
+          <w:p>
+            <w:pPr>
+              <w:spacing w:after="0" w:line="264" w:lineRule="auto"/>
+              <w:jc w:val="center"/>
+            </w:pPr>
+            <w:r>
+              <w:rPr>
+                <w:rFonts w:ascii="Arial" w:hAnsi="Arial" w:eastAsia="宋体"/>
+                <w:b w:val="0"/>
+                <w:color w:val="000000"/>
+                <w:sz w:val="20"/>
+              </w:rPr>
+              <w:t>良</w:t>
+            </w:r>
+          </w:p>
+        </w:tc>
+        <w:tc>
+          <w:tcPr>
+            <w:tcW w:type="dxa" w:w="3776"/>
+            <w:vAlign w:val="center"/>
+            <w:tcMar>
+              <w:top w:w="70" w:type="dxa"/>
+              <w:bottom w:w="70" w:type="dxa"/>
+              <w:left w:w="90" w:type="dxa"/>
+              <w:right w:w="90" w:type="dxa"/>
+            </w:tcMar>
+          </w:tcPr>
+          <w:p>
+            <w:pPr>
+              <w:spacing w:after="0" w:line="264" w:lineRule="auto"/>
+            </w:pPr>
+            <w:r>
+              <w:rPr>
+                <w:rFonts w:ascii="Arial" w:hAnsi="Arial" w:eastAsia="宋体"/>
+                <w:b w:val="0"/>
+                <w:color w:val="000000"/>
+                <w:sz w:val="20"/>
+              </w:rPr>
+              <w:t>四人职责明确；AI编码、测试、审查有记录与成果</w:t>
+            </w:r>
+          </w:p>
+        </w:tc>
+        <w:tc>
+          <w:tcPr>
+            <w:tcW w:type="dxa" w:w="2498"/>
+            <w:vAlign w:val="center"/>
+            <w:tcMar>
+              <w:top w:w="70" w:type="dxa"/>
+              <w:bottom w:w="70" w:type="dxa"/>
+              <w:left w:w="90" w:type="dxa"/>
+              <w:right w:w="90" w:type="dxa"/>
+            </w:tcMar>
+          </w:tcPr>
+          <w:p>
+            <w:pPr>
+              <w:spacing w:after="0" w:line="264" w:lineRule="auto"/>
+            </w:pPr>
+            <w:r>
+              <w:rPr>
+                <w:rFonts w:ascii="Arial" w:hAnsi="Arial" w:eastAsia="宋体"/>
+                <w:b w:val="0"/>
+                <w:color w:val="000000"/>
+                <w:sz w:val="20"/>
+              </w:rPr>
+              <w:t>原始会话及人工审查证明不足</w:t>
+            </w:r>
+          </w:p>
+        </w:tc>
+      </w:tr>
+      <w:tr>
+        <w:trPr>
+          <w:cantSplit/>
+        </w:trPr>
+        <w:tc>
+          <w:tcPr>
+            <w:tcW w:type="dxa" w:w="1569"/>
+            <w:vAlign w:val="center"/>
+            <w:tcMar>
+              <w:top w:w="70" w:type="dxa"/>
+              <w:bottom w:w="70" w:type="dxa"/>
+              <w:left w:w="90" w:type="dxa"/>
+              <w:right w:w="90" w:type="dxa"/>
+            </w:tcMar>
+          </w:tcPr>
+          <w:p>
+            <w:pPr>
+              <w:spacing w:after="0" w:line="264" w:lineRule="auto"/>
+              <w:jc w:val="center"/>
+            </w:pPr>
+            <w:r>
+              <w:rPr>
+                <w:rFonts w:ascii="Arial" w:hAnsi="Arial" w:eastAsia="宋体"/>
+                <w:b w:val="0"/>
+                <w:color w:val="000000"/>
+                <w:sz w:val="20"/>
+              </w:rPr>
+              <w:t>质量</w:t>
+            </w:r>
+          </w:p>
+        </w:tc>
+        <w:tc>
+          <w:tcPr>
+            <w:tcW w:type="dxa" w:w="1569"/>
+            <w:vAlign w:val="center"/>
+            <w:tcMar>
+              <w:top w:w="70" w:type="dxa"/>
+              <w:bottom w:w="70" w:type="dxa"/>
+              <w:left w:w="90" w:type="dxa"/>
+              <w:right w:w="90" w:type="dxa"/>
+            </w:tcMar>
+          </w:tcPr>
+          <w:p>
+            <w:pPr>
+              <w:spacing w:after="0" w:line="264" w:lineRule="auto"/>
+              <w:jc w:val="center"/>
+            </w:pPr>
+            <w:r>
+              <w:rPr>
+                <w:rFonts w:ascii="Arial" w:hAnsi="Arial" w:eastAsia="宋体"/>
+                <w:b w:val="0"/>
+                <w:color w:val="000000"/>
+                <w:sz w:val="20"/>
+              </w:rPr>
+              <w:t>良</w:t>
+            </w:r>
+          </w:p>
+        </w:tc>
+        <w:tc>
+          <w:tcPr>
+            <w:tcW w:type="dxa" w:w="3776"/>
+            <w:vAlign w:val="center"/>
+            <w:tcMar>
+              <w:top w:w="70" w:type="dxa"/>
+              <w:bottom w:w="70" w:type="dxa"/>
+              <w:left w:w="90" w:type="dxa"/>
+              <w:right w:w="90" w:type="dxa"/>
+            </w:tcMar>
+          </w:tcPr>
+          <w:p>
+            <w:pPr>
+              <w:spacing w:after="0" w:line="264" w:lineRule="auto"/>
+            </w:pPr>
+            <w:r>
+              <w:rPr>
+                <w:rFonts w:ascii="Arial" w:hAnsi="Arial" w:eastAsia="宋体"/>
+                <w:b w:val="0"/>
+                <w:color w:val="000000"/>
+                <w:sz w:val="20"/>
+              </w:rPr>
+              <w:t>24/24测试，七项人工Demo，边界与持久化验证</w:t>
+            </w:r>
+          </w:p>
+        </w:tc>
+        <w:tc>
+          <w:tcPr>
+            <w:tcW w:type="dxa" w:w="2498"/>
+            <w:vAlign w:val="center"/>
+            <w:tcMar>
+              <w:top w:w="70" w:type="dxa"/>
+              <w:bottom w:w="70" w:type="dxa"/>
+              <w:left w:w="90" w:type="dxa"/>
+              <w:right w:w="90" w:type="dxa"/>
+            </w:tcMar>
+          </w:tcPr>
+          <w:p>
+            <w:pPr>
+              <w:spacing w:after="0" w:line="264" w:lineRule="auto"/>
+            </w:pPr>
+            <w:r>
+              <w:rPr>
+                <w:rFonts w:ascii="Arial" w:hAnsi="Arial" w:eastAsia="宋体"/>
+                <w:b w:val="0"/>
+                <w:color w:val="000000"/>
+                <w:sz w:val="20"/>
+              </w:rPr>
+              <w:t>不能替代人工diff；部分异常与并发风险未覆盖</w:t>
+            </w:r>
+          </w:p>
+        </w:tc>
+      </w:tr>
+      <w:tr>
+        <w:trPr>
+          <w:cantSplit/>
+        </w:trPr>
+        <w:tc>
+          <w:tcPr>
+            <w:tcW w:type="dxa" w:w="1569"/>
+            <w:vAlign w:val="center"/>
+            <w:tcMar>
+              <w:top w:w="70" w:type="dxa"/>
+              <w:bottom w:w="70" w:type="dxa"/>
+              <w:left w:w="90" w:type="dxa"/>
+              <w:right w:w="90" w:type="dxa"/>
+            </w:tcMar>
+          </w:tcPr>
+          <w:p>
+            <w:pPr>
+              <w:spacing w:after="0" w:line="264" w:lineRule="auto"/>
+              <w:jc w:val="center"/>
+            </w:pPr>
+            <w:r>
+              <w:rPr>
+                <w:rFonts w:ascii="Arial" w:hAnsi="Arial" w:eastAsia="宋体"/>
+                <w:b w:val="0"/>
+                <w:color w:val="000000"/>
+                <w:sz w:val="20"/>
+              </w:rPr>
+              <w:t>风险</w:t>
+            </w:r>
+          </w:p>
+        </w:tc>
+        <w:tc>
+          <w:tcPr>
+            <w:tcW w:type="dxa" w:w="1569"/>
+            <w:vAlign w:val="center"/>
+            <w:tcMar>
+              <w:top w:w="70" w:type="dxa"/>
+              <w:bottom w:w="70" w:type="dxa"/>
+              <w:left w:w="90" w:type="dxa"/>
+              <w:right w:w="90" w:type="dxa"/>
+            </w:tcMar>
+          </w:tcPr>
+          <w:p>
+            <w:pPr>
+              <w:spacing w:after="0" w:line="264" w:lineRule="auto"/>
+              <w:jc w:val="center"/>
+            </w:pPr>
+            <w:r>
+              <w:rPr>
+                <w:rFonts w:ascii="Arial" w:hAnsi="Arial" w:eastAsia="宋体"/>
+                <w:b w:val="0"/>
+                <w:color w:val="000000"/>
+                <w:sz w:val="20"/>
+              </w:rPr>
+              <w:t>良</w:t>
+            </w:r>
+          </w:p>
+        </w:tc>
+        <w:tc>
+          <w:tcPr>
+            <w:tcW w:type="dxa" w:w="3776"/>
+            <w:vAlign w:val="center"/>
+            <w:tcMar>
+              <w:top w:w="70" w:type="dxa"/>
+              <w:bottom w:w="70" w:type="dxa"/>
+              <w:left w:w="90" w:type="dxa"/>
+              <w:right w:w="90" w:type="dxa"/>
+            </w:tcMar>
+          </w:tcPr>
+          <w:p>
+            <w:pPr>
+              <w:spacing w:after="0" w:line="264" w:lineRule="auto"/>
+            </w:pPr>
+            <w:r>
+              <w:rPr>
+                <w:rFonts w:ascii="Arial" w:hAnsi="Arial" w:eastAsia="宋体"/>
+                <w:b w:val="0"/>
+                <w:color w:val="000000"/>
+                <w:sz w:val="20"/>
+              </w:rPr>
+              <w:t>公共数据统一、integration预检、隔离测试</w:t>
+            </w:r>
+          </w:p>
+        </w:tc>
+        <w:tc>
+          <w:tcPr>
+            <w:tcW w:type="dxa" w:w="2498"/>
+            <w:vAlign w:val="center"/>
+            <w:tcMar>
+              <w:top w:w="70" w:type="dxa"/>
+              <w:bottom w:w="70" w:type="dxa"/>
+              <w:left w:w="90" w:type="dxa"/>
+              <w:right w:w="90" w:type="dxa"/>
+            </w:tcMar>
+          </w:tcPr>
+          <w:p>
+            <w:pPr>
+              <w:spacing w:after="0" w:line="264" w:lineRule="auto"/>
+            </w:pPr>
+            <w:r>
+              <w:rPr>
+                <w:rFonts w:ascii="Arial" w:hAnsi="Arial" w:eastAsia="宋体"/>
+                <w:b w:val="0"/>
+                <w:color w:val="000000"/>
+                <w:sz w:val="20"/>
+              </w:rPr>
+              <w:t>契约前置与同步归档仍需改进</w:t>
+            </w:r>
+          </w:p>
+        </w:tc>
+      </w:tr>
+    </w:tbl>
     <w:p>
-      <w:pPr/>
+      <w:pPr>
+        <w:spacing w:after="0" w:line="80" w:lineRule="exact"/>
+      </w:pPr>
       <w:r>
         <w:rPr>
-          <w:rFonts w:ascii="Microsoft YaHei" w:hAnsi="Microsoft YaHei" w:eastAsia="Microsoft YaHei"/>
-          <w:b/>
+          <w:rFonts w:ascii="Arial" w:hAnsi="Arial" w:eastAsia="宋体"/>
+          <w:b w:val="0"/>
           <w:color w:val="000000"/>
+          <w:sz w:val="2"/>
         </w:rPr>
-        <w:t>已确认事实：</w:t>
-      </w:r>
-      <w:r/>
-    </w:p>
-    <w:p>
-      <w:pPr>
-        <w:ind w:left="403" w:hanging="317"/>
-      </w:pPr>
-      <w:r>
-        <w:t>1. 三个 Story 已完成代码并集成 develop。</w:t>
-      </w:r>
-    </w:p>
-    <w:p>
-      <w:pPr>
-        <w:ind w:left="403" w:hanging="317"/>
-      </w:pPr>
-      <w:r>
-        <w:t>2. US01 15/15、US04 5/5、US05 4/4；全量 24/24 通过。</w:t>
-      </w:r>
-    </w:p>
-    <w:p>
-      <w:pPr>
-        <w:ind w:left="403" w:hanging="317"/>
-      </w:pPr>
-      <w:r>
-        <w:t>3. 会议时间、团队估算及正式验收尚未确认，不能提前计算计划偏差或宣称 Sprint 完成。</w:t>
-      </w:r>
-    </w:p>
-    <w:p>
-      <w:pPr/>
-      <w:r>
-        <w:rPr>
-          <w:rFonts w:ascii="Microsoft YaHei" w:hAnsi="Microsoft YaHei" w:eastAsia="Microsoft YaHei"/>
-          <w:b/>
-          <w:color w:val="000000"/>
-        </w:rPr>
-        <w:t>自评等级：</w:t>
-      </w:r>
-      <w:r>
-        <w:t>待团队确认</w:t>
-      </w:r>
-    </w:p>
-    <w:p>
-      <w:pPr/>
-      <w:r>
-        <w:rPr>
-          <w:rFonts w:ascii="Microsoft YaHei" w:hAnsi="Microsoft YaHei" w:eastAsia="Microsoft YaHei"/>
-          <w:b/>
-          <w:color w:val="000000"/>
-        </w:rPr>
-        <w:t>不足：</w:t>
-      </w:r>
-      <w:r>
-        <w:t>待团队确认</w:t>
-      </w:r>
-    </w:p>
-    <w:p>
-      <w:pPr/>
-      <w:r>
-        <w:rPr>
-          <w:rFonts w:ascii="Microsoft YaHei" w:hAnsi="Microsoft YaHei" w:eastAsia="Microsoft YaHei"/>
-          <w:b/>
-          <w:color w:val="000000"/>
-        </w:rPr>
-        <w:t>下一轮改进：</w:t>
-      </w:r>
-      <w:r>
-        <w:t>待团队确认</w:t>
       </w:r>
     </w:p>
     <w:p>
@@ -209,85 +775,22 @@
         <w:pStyle w:val="Heading1"/>
       </w:pPr>
       <w:r>
-        <w:t>三、团队与 AI</w:t>
+        <w:t>三 范围管理</w:t>
       </w:r>
     </w:p>
     <w:p>
-      <w:pPr/>
       <w:r>
-        <w:rPr>
-          <w:rFonts w:ascii="Microsoft YaHei" w:hAnsi="Microsoft YaHei" w:eastAsia="Microsoft YaHei"/>
-          <w:b/>
-          <w:color w:val="000000"/>
-        </w:rPr>
-        <w:t>已确认事实：</w:t>
-      </w:r>
-      <w:r/>
-    </w:p>
-    <w:p>
-      <w:pPr>
-        <w:ind w:left="403" w:hanging="317"/>
-      </w:pPr>
-      <w:r>
-        <w:t>1. 三个 Story 使用独立 Feature 分支开发，并通过 develop 集成。</w:t>
+        <w:t>本轮具体工作是按实验一正式规划选取US01、US04、US05，分别实现成员查看、创建并分配任务、更新任务状态。成员预置与单JSON持久化为这一切片服务，未引入登录权限、统计或多项目等后续功能。相比仅交付三个接口，前端和负责人同源使故事真正组成了业务闭环。</w:t>
       </w:r>
     </w:p>
     <w:p>
-      <w:pPr>
-        <w:ind w:left="403" w:hanging="317"/>
-      </w:pPr>
       <w:r>
-        <w:t>2. Codex、Claude Code 等 AI 参与编码、测试、文档和集成审查。</w:t>
+        <w:t>自评为优，依据是三个Must故事实现并通过技术验证，范围与正式规划一致。src、public、test以及8109119、442ee8e、79948a5、34b3df7可核验实施结果。范围控制不等于产品最终价值全部证实，目前仍是本地单项目原型，无独立外部用户评价。</w:t>
       </w:r>
     </w:p>
     <w:p>
-      <w:pPr>
-        <w:ind w:left="403" w:hanging="317"/>
-      </w:pPr>
       <w:r>
-        <w:t>3. 人类负责需求边界、接口选择和最终审查；AI 结果不能替代人工确认。</w:t>
-      </w:r>
-    </w:p>
-    <w:p>
-      <w:pPr/>
-      <w:r>
-        <w:rPr>
-          <w:rFonts w:ascii="Microsoft YaHei" w:hAnsi="Microsoft YaHei" w:eastAsia="Microsoft YaHei"/>
-          <w:b/>
-          <w:color w:val="000000"/>
-        </w:rPr>
-        <w:t>自评等级：</w:t>
-      </w:r>
-      <w:r>
-        <w:t>待团队确认</w:t>
-      </w:r>
-    </w:p>
-    <w:p>
-      <w:pPr/>
-      <w:r>
-        <w:rPr>
-          <w:rFonts w:ascii="Microsoft YaHei" w:hAnsi="Microsoft YaHei" w:eastAsia="Microsoft YaHei"/>
-          <w:b/>
-          <w:color w:val="000000"/>
-        </w:rPr>
-        <w:t>不足：</w:t>
-      </w:r>
-      <w:r>
-        <w:t>待团队确认</w:t>
-      </w:r>
-    </w:p>
-    <w:p>
-      <w:pPr/>
-      <w:r>
-        <w:rPr>
-          <w:rFonts w:ascii="Microsoft YaHei" w:hAnsi="Microsoft YaHei" w:eastAsia="Microsoft YaHei"/>
-          <w:b/>
-          <w:color w:val="000000"/>
-        </w:rPr>
-        <w:t>下一轮改进：</w:t>
-      </w:r>
-      <w:r>
-        <w:t>待团队确认</w:t>
+        <w:t>不足是本地存在另一份编号不同的早期故事地图，若混用会造成范围误读。下一轮应明确沿用正式规划基线，细化US02、US03、US06、US07、US10时保留编号和验收标准的版本关系。</w:t>
       </w:r>
     </w:p>
     <w:p>
@@ -295,93 +798,22 @@
         <w:pStyle w:val="Heading1"/>
       </w:pPr>
       <w:r>
-        <w:t>四、质量</w:t>
+        <w:t>四 进度管理</w:t>
       </w:r>
     </w:p>
     <w:p>
-      <w:pPr/>
       <w:r>
-        <w:rPr>
-          <w:rFonts w:ascii="Microsoft YaHei" w:hAnsi="Microsoft YaHei" w:eastAsia="Microsoft YaHei"/>
-          <w:b/>
-          <w:color w:val="000000"/>
-        </w:rPr>
-        <w:t>已确认事实：</w:t>
-      </w:r>
-      <w:r/>
-    </w:p>
-    <w:p>
-      <w:pPr>
-        <w:ind w:left="403" w:hanging="317"/>
-      </w:pPr>
-      <w:r>
-        <w:t>1. 自动测试 24/24 通过，0 失败。</w:t>
+        <w:t>本轮具体工作按实际历史经历了工程基础、US04/US05分支开发与合并、US01增强、integration预检、develop集成和最终人工Demo。9月19日的共享文件合并、9月20日的成员增强、9月21日的集成、9月22日的Demo都有提交或用户确认。10月8日为交付材料追溯整理与回归检查，不写成新增课堂开发时段。</w:t>
       </w:r>
     </w:p>
     <w:p>
-      <w:pPr>
-        <w:ind w:left="403" w:hanging="317"/>
-      </w:pPr>
       <w:r>
-        <w:t>2. 成员查看、任务创建与分配、刷新持久化、TODO → DOING → DONE 及再次刷新均已验证。</w:t>
+        <w:t>自评为良，依据是首轮增量最终完成，集成后已有24项回归与最终链路结果。未留存可靠原始估算和承诺截止时间，不能证明“提前完成”或给出时间偏差百分比。US01个人阶段的推送障碍也不等于团队最终仍未集成。</w:t>
       </w:r>
     </w:p>
     <w:p>
-      <w:pPr>
-        <w:ind w:left="403" w:hanging="317"/>
-      </w:pPr>
       <w:r>
-        <w:t>3. 2026-09-22 用户确认最终人工 Demo 七项全部通过。</w:t>
-      </w:r>
-    </w:p>
-    <w:p>
-      <w:pPr>
-        <w:ind w:left="403" w:hanging="317"/>
-      </w:pPr>
-      <w:r>
-        <w:t>4. 测试使用隔离数据；人工 Demo 使用的数据变更仍保留在本地工作区，未纳入本次文档提交。</w:t>
-      </w:r>
-    </w:p>
-    <w:p>
-      <w:pPr/>
-      <w:r>
-        <w:rPr>
-          <w:rFonts w:ascii="Microsoft YaHei" w:hAnsi="Microsoft YaHei" w:eastAsia="Microsoft YaHei"/>
-          <w:b/>
-          <w:color w:val="000000"/>
-        </w:rPr>
-        <w:t>自评等级：</w:t>
-      </w:r>
-      <w:r>
-        <w:t>待团队确认</w:t>
-      </w:r>
-    </w:p>
-    <w:p>
-      <w:pPr/>
-      <w:r>
-        <w:rPr>
-          <w:rFonts w:ascii="Microsoft YaHei" w:hAnsi="Microsoft YaHei" w:eastAsia="Microsoft YaHei"/>
-          <w:b/>
-          <w:color w:val="000000"/>
-        </w:rPr>
-        <w:t>不足：</w:t>
-      </w:r>
-      <w:r>
-        <w:t>待团队确认</w:t>
-      </w:r>
-    </w:p>
-    <w:p>
-      <w:pPr/>
-      <w:r>
-        <w:rPr>
-          <w:rFonts w:ascii="Microsoft YaHei" w:hAnsi="Microsoft YaHei" w:eastAsia="Microsoft YaHei"/>
-          <w:b/>
-          <w:color w:val="000000"/>
-        </w:rPr>
-        <w:t>下一轮改进：</w:t>
-      </w:r>
-      <w:r>
-        <w:t>待团队确认</w:t>
+        <w:t>不足是集成窗口和共享文件协调未充分前置。下一轮应在计划中预留集成阶段，按真实日期记录Feature准备、审查、回归和Review结果，而非事后只用提交时刻代替过程计划。</w:t>
       </w:r>
     </w:p>
     <w:p>
@@ -389,85 +821,22 @@
         <w:pStyle w:val="Heading1"/>
       </w:pPr>
       <w:r>
-        <w:t>五、风险</w:t>
+        <w:t>五 团队与AI管理</w:t>
       </w:r>
     </w:p>
     <w:p>
-      <w:pPr/>
       <w:r>
-        <w:rPr>
-          <w:rFonts w:ascii="Microsoft YaHei" w:hAnsi="Microsoft YaHei" w:eastAsia="Microsoft YaHei"/>
-          <w:b/>
-          <w:color w:val="000000"/>
-        </w:rPr>
-        <w:t>已确认事实：</w:t>
-      </w:r>
-      <w:r/>
-    </w:p>
-    <w:p>
-      <w:pPr>
-        <w:ind w:left="403" w:hanging="317"/>
-      </w:pPr>
-      <w:r>
-        <w:t>1. 多名成员修改共享前端和数据文件，存在集成风险。</w:t>
+        <w:t>四人责任与功能落点清晰，US04提供工程与数据基础，US05补状态逻辑，US01复用基础完善成员能力，DRI统筹集成与最终演示。AI参与了方案、代码、测试、静态审查和文档，使开发任务能够分工执行并相互检查。</w:t>
       </w:r>
     </w:p>
     <w:p>
-      <w:pPr>
-        <w:ind w:left="403" w:hanging="317"/>
-      </w:pPr>
       <w:r>
-        <w:t>2. US01 与 US04 / US05 共用 Member、Task 和页面，需要防止覆盖已有功能。</w:t>
+        <w:t>自评为良，依据是分支、模型、测试与17条历史互动记录可检索，US01还有已保存输入摘录和浏览器证据。记录不等于全量原始对话；US05工具身份和细粒度互动缺失，部分US04登记时刻与提交顺序不一致。人类diff审查无独立记录，不能把AI审查的角色分离称为人类审查已完成。</w:t>
       </w:r>
     </w:p>
     <w:p>
-      <w:pPr>
-        <w:ind w:left="403" w:hanging="317"/>
-      </w:pPr>
       <w:r>
-        <w:t>3. 最终使用 integration/us01-merge 完成差异审查、全量测试和链路验证后再合入 develop。</w:t>
-      </w:r>
-    </w:p>
-    <w:p>
-      <w:pPr/>
-      <w:r>
-        <w:rPr>
-          <w:rFonts w:ascii="Microsoft YaHei" w:hAnsi="Microsoft YaHei" w:eastAsia="Microsoft YaHei"/>
-          <w:b/>
-          <w:color w:val="000000"/>
-        </w:rPr>
-        <w:t>自评等级：</w:t>
-      </w:r>
-      <w:r>
-        <w:t>待团队确认</w:t>
-      </w:r>
-    </w:p>
-    <w:p>
-      <w:pPr/>
-      <w:r>
-        <w:rPr>
-          <w:rFonts w:ascii="Microsoft YaHei" w:hAnsi="Microsoft YaHei" w:eastAsia="Microsoft YaHei"/>
-          <w:b/>
-          <w:color w:val="000000"/>
-        </w:rPr>
-        <w:t>不足：</w:t>
-      </w:r>
-      <w:r>
-        <w:t>待团队确认</w:t>
-      </w:r>
-    </w:p>
-    <w:p>
-      <w:pPr/>
-      <w:r>
-        <w:rPr>
-          <w:rFonts w:ascii="Microsoft YaHei" w:hAnsi="Microsoft YaHei" w:eastAsia="Microsoft YaHei"/>
-          <w:b/>
-          <w:color w:val="000000"/>
-        </w:rPr>
-        <w:t>下一轮改进：</w:t>
-      </w:r>
-      <w:r>
-        <w:t>待团队确认</w:t>
+        <w:t>不足集中在证据归档而不是已证明的个人怠工。下一轮由何健翔协调同步会话记录，各成员保存原始输入输出，人工审查者记录实际diff版本和处置。需求与取舍仍由人类承担，AI不能自动决定扩展范围或接收交付。</w:t>
       </w:r>
     </w:p>
     <w:p>
@@ -475,69 +844,102 @@
         <w:pStyle w:val="Heading1"/>
       </w:pPr>
       <w:r>
-        <w:t>六、AI 专项评估草稿</w:t>
+        <w:t>六 质量管理</w:t>
+      </w:r>
+    </w:p>
+    <w:p>
+      <w:r>
+        <w:t>本轮具体工作包括后端标题与负责人校验、状态枚举限制、成员唯一性与非法字段处理、页面加载空态和重试、统一文件持久化与隔离测试。US01 15/15、US04 5/5、US05 4/4，合计24/24；历史浏览器8/8与9月22日七项人工操作检查均通过。刷新后任务与DONE状态保留，支撑当前正常操作的可靠性。</w:t>
+      </w:r>
+    </w:p>
+    <w:p>
+      <w:r>
+        <w:t>自评为良。证据为docs/evidence/us01-tests.tap、us01-browser-results.json、截图、用户Demo确认及本次sprint1-final-test-20261008.txt。AI静态审查未见Blocker/Major，发现状态常量重复与静态健康提示两个Minor。这些结论只在当前范围有效，不等于没有潜在缺陷或正式全DoD通过。</w:t>
+      </w:r>
+    </w:p>
+    <w:p>
+      <w:r>
+        <w:t>不足包括独立人工diff证明缺失、创建和状态请求网络错误处理与文件写入失败专项测试不足、单JSON存储非原子且不支持生产级并发保证。下一轮应补异常测试、统一错误响应，并按真实审查过程保存记录；不为文档结论偷偷改动本轮代码或测试。</w:t>
       </w:r>
     </w:p>
     <w:p>
       <w:pPr>
-        <w:ind w:left="403" w:hanging="317"/>
+        <w:pStyle w:val="Heading1"/>
       </w:pPr>
       <w:r>
-        <w:t>1. 编码智能体表现：已完成约定范围内的代码生成与修改；质量等级待团队确认。</w:t>
+        <w:t>七 风险管理</w:t>
+      </w:r>
+    </w:p>
+    <w:p>
+      <w:r>
+        <w:t>本轮具体工作是统一Member和Task模型、让assigneeId引用同一成员来源、将US05独立存储并入公共数据层、在integration分支预检US01、保留全部故事回归并隔离临时数据。79948a5体现真实冲突处置，cc7c937/34b3df7体现预检与合并，main没有被提前更新。</w:t>
+      </w:r>
+    </w:p>
+    <w:p>
+      <w:r>
+        <w:t>自评为良，依据是跨故事冲突已解决，三个故事没有退化，当前演示数据在本次测试前后保持不变。不能因为后续US01没有文本冲突就断言接口没有风险，也不能把所有静态风险写成已发生故障。</w:t>
+      </w:r>
+    </w:p>
+    <w:p>
+      <w:r>
+        <w:t>不足是公共契约与日志归档偏后，AI生成逻辑可能在未覆盖异常下产生问题。下一轮先确定共享文件责任和接口异常行为，保留集成窗口，明确本地文件方案的适用边界。权限和并发能力应随既有Backlog逐步设计，不无依据扩展本轮完成范围。</w:t>
       </w:r>
     </w:p>
     <w:p>
       <w:pPr>
-        <w:ind w:left="403" w:hanging="317"/>
+        <w:pStyle w:val="Heading1"/>
       </w:pPr>
       <w:r>
-        <w:t>2. 测试智能体表现：已建立并执行 24 项自动测试；充分性评价待团队确认。</w:t>
+        <w:t>八 AI专项评估</w:t>
+      </w:r>
+    </w:p>
+    <w:p>
+      <w:r>
+        <w:t>编码智能体方面，Claude Code在US04登记中承担方案、脚手架、前后端创建能力；Codex在US01中完善成员契约、加载错误边界与已有工程复用；US05概要体现AI参与状态逻辑与测试，但不能确定未记录的模型身份。其主要贡献是形成可运行原型并补全相互依赖的实现。</w:t>
+      </w:r>
+    </w:p>
+    <w:p>
+      <w:r>
+        <w:t>测试智能体方面，历史证据包含全量24项与8项浏览器检查，能够发现接口契约或刷新行为退化。US01原记录未发生功能测试失败修复，不能虚构失败来增加过程感。US04早期测试入口修复来自原登记摘要，缺少独立失败日志。</w:t>
+      </w:r>
+    </w:p>
+    <w:p>
+      <w:r>
+        <w:t>代码审查智能体方面，静态审查关注共享模型、非法输入、注释和范围，未见当前阻断问题，保留两个Minor及后续异常风险。AI审查可以提出具体问题，但同属自动化工具，不能给人工Review项提供独立人类确认。</w:t>
+      </w:r>
+    </w:p>
+    <w:p>
+      <w:r>
+        <w:t>AI引入的风险包括生成独立数据源、重复枚举、只覆盖正常路径以及输出看似完整但原始记录不足。使用多个角色也可能共享相同假设，因此必须以运行证据交叉检查。</w:t>
+      </w:r>
+    </w:p>
+    <w:p>
+      <w:r>
+        <w:t>人类不可替代的职责是确认产品范围、选择架构与数据约束、阅读真实diff、处理反馈并接收交付。已确认的DRI最终Demo为人工接收提供使用层证据；尚无人工diff证明就不能宣称该责任已经完成。下一Sprint应把契约、会话、人工审查和独立集成分别落实。</w:t>
       </w:r>
     </w:p>
     <w:p>
       <w:pPr>
-        <w:ind w:left="403" w:hanging="317"/>
+        <w:pStyle w:val="Heading1"/>
       </w:pPr>
       <w:r>
-        <w:t>3. 代码审查智能体表现：未发现 Blocker / Major，记录 2 项 Minor；最终采纳意见待 DRI 确认。</w:t>
+        <w:t>九 总结与后续方向</w:t>
       </w:r>
     </w:p>
     <w:p>
-      <w:pPr>
-        <w:ind w:left="403" w:hanging="317"/>
-      </w:pPr>
       <w:r>
-        <w:t>4. AI 的主要贡献：代码、测试、异常处理、文档模板、证据整理和集成检查；重要性评价待团队确认。</w:t>
+        <w:t>本轮首个切片完成的意义在于成员、负责人、任务和状态已有一致的数据关系，可以承接实验一后续登录权限、任务属性、迭代归属与统计。质量成绩支撑技术目标，但不足以覆盖全部课程过程要求。五维评价保留对范围执行的肯定，也把进度证明、原始AI会话和人工审查的缺口纳入等级理由。</w:t>
       </w:r>
     </w:p>
     <w:p>
-      <w:pPr>
-        <w:ind w:left="403" w:hanging="317"/>
-      </w:pPr>
       <w:r>
-        <w:t>5. AI 带来的风险：可能遗漏上下文、产生重复实现或把自动判断误当成人工结论；影响程度待团队确认。</w:t>
-      </w:r>
-    </w:p>
-    <w:p>
-      <w:pPr>
-        <w:ind w:left="403" w:hanging="317"/>
-      </w:pPr>
-      <w:r>
-        <w:t>6. 必须由人完成的判断：最终 diff 审查、DoD、Sprint Review、Retrospective、自评等级和 DRI 寄语定稿。</w:t>
-      </w:r>
-    </w:p>
-    <w:p>
-      <w:pPr>
-        <w:ind w:left="403" w:hanging="317"/>
-      </w:pPr>
-      <w:r>
-        <w:t>7. 人机分工原则：AI 提供可验证产物与建议，人类决定范围、接受变更并承担最终验收责任；待团队确认。</w:t>
+        <w:t>建议优先落实公共契约、同步原始记录与人工审查、预留集成窗口三个改进，再展开既有Sprint2计划。这是依据本轮证据形成的自评与建议，未补造正式会议、投票、教师意见或额外个人承诺。</w:t>
       </w:r>
     </w:p>
     <w:sectPr>
       <w:footerReference w:type="default" r:id="rId9"/>
-      <w:pgSz w:w="12240" w:h="15840"/>
-      <w:pgMar w:top="1123" w:right="1181" w:bottom="1037" w:left="1181" w:header="720" w:footer="720" w:gutter="0"/>
+      <w:pgSz w:w="11906" w:h="16838"/>
+      <w:pgMar w:top="1134" w:right="1247" w:bottom="1134" w:left="1247" w:header="720" w:footer="720" w:gutter="0"/>
       <w:cols w:space="720"/>
       <w:docGrid w:linePitch="360"/>
     </w:sectPr>
@@ -554,15 +956,22 @@
     </w:pPr>
     <w:r>
       <w:rPr>
-        <w:rFonts w:ascii="Microsoft YaHei" w:hAnsi="Microsoft YaHei" w:eastAsia="Microsoft YaHei"/>
-        <w:color w:val="666666"/>
+        <w:rFonts w:ascii="Arial" w:hAnsi="Arial" w:eastAsia="宋体"/>
+        <w:b w:val="0"/>
+        <w:color w:val="000000"/>
         <w:sz w:val="18"/>
       </w:rPr>
-      <w:fldChar w:fldCharType="begin"/>
-      <w:instrText xml:space="preserve"> PAGE </w:instrText>
-      <w:fldChar w:fldCharType="separate"/>
-      <w:t>1</w:t>
-      <w:fldChar w:fldCharType="end"/>
+      <w:t xml:space="preserve">第 </w:t>
+    </w:r>
+    <w:fldSimple w:instr="PAGE"/>
+    <w:r>
+      <w:rPr>
+        <w:rFonts w:ascii="Arial" w:hAnsi="Arial" w:eastAsia="宋体"/>
+        <w:b w:val="0"/>
+        <w:color w:val="000000"/>
+        <w:sz w:val="18"/>
+      </w:rPr>
+      <w:t xml:space="preserve"> 页</w:t>
     </w:r>
   </w:p>
 </w:ftr>
@@ -932,10 +1341,12 @@
     <w:qFormat/>
     <w:rsid w:val="00FC693F"/>
     <w:pPr>
-      <w:spacing w:after="100" w:line="276" w:lineRule="auto"/>
+      <w:widowControl/>
+      <w:spacing w:after="80" w:before="0" w:line="276" w:lineRule="auto"/>
     </w:pPr>
     <w:rPr>
-      <w:rFonts w:ascii="Microsoft YaHei" w:hAnsi="Microsoft YaHei" w:eastAsia="Microsoft YaHei"/>
+      <w:rFonts w:ascii="Arial" w:hAnsi="Arial" w:eastAsia="宋体"/>
+      <w:b w:val="0"/>
       <w:color w:val="000000"/>
       <w:sz w:val="22"/>
     </w:rPr>
@@ -995,11 +1406,12 @@
     <w:pPr>
       <w:keepNext/>
       <w:keepLines/>
-      <w:spacing w:before="260" w:after="120"/>
+      <w:widowControl/>
+      <w:spacing w:before="160" w:after="120" w:line="276" w:lineRule="auto"/>
       <w:outlineLvl w:val="0"/>
     </w:pPr>
     <w:rPr>
-      <w:rFonts w:asciiTheme="majorHAnsi" w:eastAsiaTheme="majorEastAsia" w:hAnsiTheme="majorHAnsi" w:cstheme="majorBidi" w:ascii="Microsoft YaHei" w:hAnsi="Microsoft YaHei" w:eastAsia="Microsoft YaHei"/>
+      <w:rFonts w:ascii="Arial" w:hAnsi="Arial" w:eastAsia="黑体"/>
       <w:b/>
       <w:bCs/>
       <w:color w:val="000000"/>
@@ -1019,11 +1431,12 @@
     <w:pPr>
       <w:keepNext/>
       <w:keepLines/>
-      <w:spacing w:before="180" w:after="80"/>
+      <w:widowControl/>
+      <w:spacing w:before="160" w:after="120" w:line="276" w:lineRule="auto"/>
       <w:outlineLvl w:val="1"/>
     </w:pPr>
     <w:rPr>
-      <w:rFonts w:asciiTheme="majorHAnsi" w:eastAsiaTheme="majorEastAsia" w:hAnsiTheme="majorHAnsi" w:cstheme="majorBidi" w:ascii="Microsoft YaHei" w:hAnsi="Microsoft YaHei" w:eastAsia="Microsoft YaHei"/>
+      <w:rFonts w:ascii="Arial" w:hAnsi="Arial" w:eastAsia="黑体"/>
       <w:b/>
       <w:bCs/>
       <w:color w:val="000000"/>
@@ -1050,7 +1463,7 @@
       <w:rFonts w:asciiTheme="majorHAnsi" w:eastAsiaTheme="majorEastAsia" w:hAnsiTheme="majorHAnsi" w:cstheme="majorBidi"/>
       <w:b/>
       <w:bCs/>
-      <w:color w:val="4F81BD" w:themeColor="accent1"/>
+      <w:color w:val="000000"/>
     </w:rPr>
   </w:style>
   <w:style w:type="paragraph" w:styleId="Heading4">
@@ -1075,7 +1488,7 @@
       <w:bCs/>
       <w:i/>
       <w:iCs/>
-      <w:color w:val="4F81BD" w:themeColor="accent1"/>
+      <w:color w:val="000000"/>
     </w:rPr>
   </w:style>
   <w:style w:type="paragraph" w:styleId="Heading5">
@@ -1096,7 +1509,7 @@
     </w:pPr>
     <w:rPr>
       <w:rFonts w:asciiTheme="majorHAnsi" w:eastAsiaTheme="majorEastAsia" w:hAnsiTheme="majorHAnsi" w:cstheme="majorBidi"/>
-      <w:color w:val="243F60" w:themeColor="accent1" w:themeShade="7F"/>
+      <w:color w:val="000000"/>
     </w:rPr>
   </w:style>
   <w:style w:type="paragraph" w:styleId="Heading6">
@@ -1119,7 +1532,7 @@
       <w:rFonts w:asciiTheme="majorHAnsi" w:eastAsiaTheme="majorEastAsia" w:hAnsiTheme="majorHAnsi" w:cstheme="majorBidi"/>
       <w:i/>
       <w:iCs/>
-      <w:color w:val="243F60" w:themeColor="accent1" w:themeShade="7F"/>
+      <w:color w:val="000000"/>
     </w:rPr>
   </w:style>
   <w:style w:type="paragraph" w:styleId="Heading7">
@@ -1142,7 +1555,7 @@
       <w:rFonts w:asciiTheme="majorHAnsi" w:eastAsiaTheme="majorEastAsia" w:hAnsiTheme="majorHAnsi" w:cstheme="majorBidi"/>
       <w:i/>
       <w:iCs/>
-      <w:color w:val="404040" w:themeColor="text1" w:themeTint="BF"/>
+      <w:color w:val="000000"/>
     </w:rPr>
   </w:style>
   <w:style w:type="paragraph" w:styleId="Heading8">
@@ -1163,7 +1576,7 @@
     </w:pPr>
     <w:rPr>
       <w:rFonts w:asciiTheme="majorHAnsi" w:eastAsiaTheme="majorEastAsia" w:hAnsiTheme="majorHAnsi" w:cstheme="majorBidi"/>
-      <w:color w:val="4F81BD" w:themeColor="accent1"/>
+      <w:color w:val="000000"/>
       <w:sz w:val="20"/>
       <w:szCs w:val="20"/>
     </w:rPr>
@@ -1188,7 +1601,7 @@
       <w:rFonts w:asciiTheme="majorHAnsi" w:eastAsiaTheme="majorEastAsia" w:hAnsiTheme="majorHAnsi" w:cstheme="majorBidi"/>
       <w:i/>
       <w:iCs/>
-      <w:color w:val="404040" w:themeColor="text1" w:themeTint="BF"/>
+      <w:color w:val="000000"/>
       <w:sz w:val="20"/>
       <w:szCs w:val="20"/>
     </w:rPr>
@@ -1239,7 +1652,7 @@
       <w:rFonts w:asciiTheme="majorHAnsi" w:eastAsiaTheme="majorEastAsia" w:hAnsiTheme="majorHAnsi" w:cstheme="majorBidi"/>
       <w:b/>
       <w:bCs/>
-      <w:color w:val="365F91" w:themeColor="accent1" w:themeShade="BF"/>
+      <w:color w:val="000000"/>
       <w:sz w:val="28"/>
       <w:szCs w:val="28"/>
     </w:rPr>
@@ -1254,7 +1667,7 @@
       <w:rFonts w:asciiTheme="majorHAnsi" w:eastAsiaTheme="majorEastAsia" w:hAnsiTheme="majorHAnsi" w:cstheme="majorBidi"/>
       <w:b/>
       <w:bCs/>
-      <w:color w:val="4F81BD" w:themeColor="accent1"/>
+      <w:color w:val="000000"/>
       <w:sz w:val="26"/>
       <w:szCs w:val="26"/>
     </w:rPr>
@@ -1269,7 +1682,7 @@
       <w:rFonts w:asciiTheme="majorHAnsi" w:eastAsiaTheme="majorEastAsia" w:hAnsiTheme="majorHAnsi" w:cstheme="majorBidi"/>
       <w:b/>
       <w:bCs/>
-      <w:color w:val="4F81BD" w:themeColor="accent1"/>
+      <w:color w:val="000000"/>
     </w:rPr>
   </w:style>
   <w:style w:type="paragraph" w:styleId="Title">
@@ -1282,14 +1695,12 @@
     <w:rsid w:val="00FC693F"/>
     <w:pPr>
       <w:keepNext/>
-      <w:pBdr>
-        <w:bottom w:val="single" w:sz="8" w:space="4" w:color="4F81BD" w:themeColor="accent1"/>
-      </w:pBdr>
-      <w:spacing w:after="320" w:line="240" w:lineRule="auto"/>
+      <w:widowControl/>
+      <w:spacing w:after="120" w:line="276" w:lineRule="auto" w:before="0"/>
       <w:contextualSpacing/>
     </w:pPr>
     <w:rPr>
-      <w:rFonts w:asciiTheme="majorHAnsi" w:eastAsiaTheme="majorEastAsia" w:hAnsiTheme="majorHAnsi" w:cstheme="majorBidi" w:ascii="Microsoft YaHei" w:hAnsi="Microsoft YaHei" w:eastAsia="Microsoft YaHei"/>
+      <w:rFonts w:ascii="Arial" w:hAnsi="Arial" w:eastAsia="黑体"/>
       <w:b/>
       <w:color w:val="000000"/>
       <w:spacing w:val="5"/>
@@ -1306,7 +1717,7 @@
     <w:rsid w:val="00FC693F"/>
     <w:rPr>
       <w:rFonts w:asciiTheme="majorHAnsi" w:eastAsiaTheme="majorEastAsia" w:hAnsiTheme="majorHAnsi" w:cstheme="majorBidi"/>
-      <w:color w:val="17365D" w:themeColor="text2" w:themeShade="BF"/>
+      <w:color w:val="000000"/>
       <w:spacing w:val="5"/>
       <w:kern w:val="28"/>
       <w:sz w:val="52"/>
@@ -1330,7 +1741,7 @@
       <w:rFonts w:asciiTheme="majorHAnsi" w:eastAsiaTheme="majorEastAsia" w:hAnsiTheme="majorHAnsi" w:cstheme="majorBidi"/>
       <w:i/>
       <w:iCs/>
-      <w:color w:val="4F81BD" w:themeColor="accent1"/>
+      <w:color w:val="000000"/>
       <w:spacing w:val="15"/>
       <w:sz w:val="24"/>
       <w:szCs w:val="24"/>
@@ -1346,7 +1757,7 @@
       <w:rFonts w:asciiTheme="majorHAnsi" w:eastAsiaTheme="majorEastAsia" w:hAnsiTheme="majorHAnsi" w:cstheme="majorBidi"/>
       <w:i/>
       <w:iCs/>
-      <w:color w:val="4F81BD" w:themeColor="accent1"/>
+      <w:color w:val="000000"/>
       <w:spacing w:val="15"/>
       <w:sz w:val="24"/>
       <w:szCs w:val="24"/>
@@ -1618,7 +2029,7 @@
     <w:rPr>
       <w:i/>
       <w:iCs/>
-      <w:color w:val="000000" w:themeColor="text1"/>
+      <w:color w:val="000000"/>
     </w:rPr>
   </w:style>
   <w:style w:type="character" w:customStyle="1" w:styleId="QuoteChar">
@@ -1630,7 +2041,7 @@
     <w:rPr>
       <w:i/>
       <w:iCs/>
-      <w:color w:val="000000" w:themeColor="text1"/>
+      <w:color w:val="000000"/>
     </w:rPr>
   </w:style>
   <w:style w:type="character" w:customStyle="1" w:styleId="Heading4Char">
@@ -1646,7 +2057,7 @@
       <w:bCs/>
       <w:i/>
       <w:iCs/>
-      <w:color w:val="4F81BD" w:themeColor="accent1"/>
+      <w:color w:val="000000"/>
     </w:rPr>
   </w:style>
   <w:style w:type="character" w:customStyle="1" w:styleId="Heading5Char">
@@ -1658,7 +2069,7 @@
     <w:rsid w:val="00FC693F"/>
     <w:rPr>
       <w:rFonts w:asciiTheme="majorHAnsi" w:eastAsiaTheme="majorEastAsia" w:hAnsiTheme="majorHAnsi" w:cstheme="majorBidi"/>
-      <w:color w:val="243F60" w:themeColor="accent1" w:themeShade="7F"/>
+      <w:color w:val="000000"/>
     </w:rPr>
   </w:style>
   <w:style w:type="character" w:customStyle="1" w:styleId="Heading6Char">
@@ -1672,7 +2083,7 @@
       <w:rFonts w:asciiTheme="majorHAnsi" w:eastAsiaTheme="majorEastAsia" w:hAnsiTheme="majorHAnsi" w:cstheme="majorBidi"/>
       <w:i/>
       <w:iCs/>
-      <w:color w:val="243F60" w:themeColor="accent1" w:themeShade="7F"/>
+      <w:color w:val="000000"/>
     </w:rPr>
   </w:style>
   <w:style w:type="character" w:customStyle="1" w:styleId="Heading7Char">
@@ -1686,7 +2097,7 @@
       <w:rFonts w:asciiTheme="majorHAnsi" w:eastAsiaTheme="majorEastAsia" w:hAnsiTheme="majorHAnsi" w:cstheme="majorBidi"/>
       <w:i/>
       <w:iCs/>
-      <w:color w:val="404040" w:themeColor="text1" w:themeTint="BF"/>
+      <w:color w:val="000000"/>
     </w:rPr>
   </w:style>
   <w:style w:type="character" w:customStyle="1" w:styleId="Heading8Char">
@@ -1698,7 +2109,7 @@
     <w:rsid w:val="00FC693F"/>
     <w:rPr>
       <w:rFonts w:asciiTheme="majorHAnsi" w:eastAsiaTheme="majorEastAsia" w:hAnsiTheme="majorHAnsi" w:cstheme="majorBidi"/>
-      <w:color w:val="4F81BD" w:themeColor="accent1"/>
+      <w:color w:val="000000"/>
       <w:sz w:val="20"/>
       <w:szCs w:val="20"/>
     </w:rPr>
@@ -1714,7 +2125,7 @@
       <w:rFonts w:asciiTheme="majorHAnsi" w:eastAsiaTheme="majorEastAsia" w:hAnsiTheme="majorHAnsi" w:cstheme="majorBidi"/>
       <w:i/>
       <w:iCs/>
-      <w:color w:val="404040" w:themeColor="text1" w:themeTint="BF"/>
+      <w:color w:val="000000"/>
       <w:sz w:val="20"/>
       <w:szCs w:val="20"/>
     </w:rPr>
@@ -1734,7 +2145,7 @@
     <w:rPr>
       <w:b/>
       <w:bCs/>
-      <w:color w:val="4F81BD" w:themeColor="accent1"/>
+      <w:color w:val="000000"/>
       <w:sz w:val="18"/>
       <w:szCs w:val="18"/>
     </w:rPr>
@@ -1770,9 +2181,6 @@
     <w:qFormat/>
     <w:rsid w:val="00FC693F"/>
     <w:pPr>
-      <w:pBdr>
-        <w:bottom w:val="single" w:sz="4" w:space="4" w:color="4F81BD" w:themeColor="accent1"/>
-      </w:pBdr>
       <w:spacing w:before="200" w:after="280"/>
       <w:ind w:left="936" w:right="936"/>
     </w:pPr>
@@ -1781,7 +2189,7 @@
       <w:bCs/>
       <w:i/>
       <w:iCs/>
-      <w:color w:val="4F81BD" w:themeColor="accent1"/>
+      <w:color w:val="000000"/>
     </w:rPr>
   </w:style>
   <w:style w:type="character" w:customStyle="1" w:styleId="IntenseQuoteChar">
@@ -1795,7 +2203,7 @@
       <w:bCs/>
       <w:i/>
       <w:iCs/>
-      <w:color w:val="4F81BD" w:themeColor="accent1"/>
+      <w:color w:val="000000"/>
     </w:rPr>
   </w:style>
   <w:style w:type="character" w:styleId="SubtleEmphasis">
@@ -1807,7 +2215,7 @@
     <w:rPr>
       <w:i/>
       <w:iCs/>
-      <w:color w:val="808080" w:themeColor="text1" w:themeTint="7F"/>
+      <w:color w:val="000000"/>
     </w:rPr>
   </w:style>
   <w:style w:type="character" w:styleId="IntenseEmphasis">
@@ -1821,7 +2229,7 @@
       <w:bCs/>
       <w:i/>
       <w:iCs/>
-      <w:color w:val="4F81BD" w:themeColor="accent1"/>
+      <w:color w:val="000000"/>
     </w:rPr>
   </w:style>
   <w:style w:type="character" w:styleId="SubtleReference">
@@ -1832,7 +2240,7 @@
     <w:rsid w:val="00FC693F"/>
     <w:rPr>
       <w:smallCaps/>
-      <w:color w:val="C0504D" w:themeColor="accent2"/>
+      <w:color w:val="000000"/>
       <w:u w:val="single"/>
     </w:rPr>
   </w:style>
@@ -1846,7 +2254,7 @@
       <w:b/>
       <w:bCs/>
       <w:smallCaps/>
-      <w:color w:val="C0504D" w:themeColor="accent2"/>
+      <w:color w:val="000000"/>
       <w:spacing w:val="5"/>
       <w:u w:val="single"/>
     </w:rPr>
@@ -1912,7 +2320,7 @@
       <w:spacing w:after="0" w:line="240" w:lineRule="auto"/>
     </w:pPr>
     <w:rPr>
-      <w:color w:val="000000" w:themeColor="text1" w:themeShade="BF"/>
+      <w:color w:val="000000"/>
     </w:rPr>
     <w:tblPr>
       <w:tblStyleRowBandSize w:val="1"/>
@@ -2015,7 +2423,7 @@
       <w:spacing w:after="0" w:line="240" w:lineRule="auto"/>
     </w:pPr>
     <w:rPr>
-      <w:color w:val="365F91" w:themeColor="accent1" w:themeShade="BF"/>
+      <w:color w:val="000000"/>
     </w:rPr>
     <w:tblPr>
       <w:tblStyleRowBandSize w:val="1"/>
@@ -2118,7 +2526,7 @@
       <w:spacing w:after="0" w:line="240" w:lineRule="auto"/>
     </w:pPr>
     <w:rPr>
-      <w:color w:val="943634" w:themeColor="accent2" w:themeShade="BF"/>
+      <w:color w:val="000000"/>
     </w:rPr>
     <w:tblPr>
       <w:tblStyleRowBandSize w:val="1"/>
@@ -2221,7 +2629,7 @@
       <w:spacing w:after="0" w:line="240" w:lineRule="auto"/>
     </w:pPr>
     <w:rPr>
-      <w:color w:val="76923C" w:themeColor="accent3" w:themeShade="BF"/>
+      <w:color w:val="000000"/>
     </w:rPr>
     <w:tblPr>
       <w:tblStyleRowBandSize w:val="1"/>
@@ -2324,7 +2732,7 @@
       <w:spacing w:after="0" w:line="240" w:lineRule="auto"/>
     </w:pPr>
     <w:rPr>
-      <w:color w:val="5F497A" w:themeColor="accent4" w:themeShade="BF"/>
+      <w:color w:val="000000"/>
     </w:rPr>
     <w:tblPr>
       <w:tblStyleRowBandSize w:val="1"/>
@@ -2427,7 +2835,7 @@
       <w:spacing w:after="0" w:line="240" w:lineRule="auto"/>
     </w:pPr>
     <w:rPr>
-      <w:color w:val="31849B" w:themeColor="accent5" w:themeShade="BF"/>
+      <w:color w:val="000000"/>
     </w:rPr>
     <w:tblPr>
       <w:tblStyleRowBandSize w:val="1"/>
@@ -2530,7 +2938,7 @@
       <w:spacing w:after="0" w:line="240" w:lineRule="auto"/>
     </w:pPr>
     <w:rPr>
-      <w:color w:val="E36C0A" w:themeColor="accent6" w:themeShade="BF"/>
+      <w:color w:val="000000"/>
     </w:rPr>
     <w:tblPr>
       <w:tblStyleRowBandSize w:val="1"/>
@@ -2656,7 +3064,7 @@
       <w:rPr>
         <w:b/>
         <w:bCs/>
-        <w:color w:val="FFFFFF" w:themeColor="background1"/>
+        <w:color w:val="000000"/>
       </w:rPr>
       <w:tblPr/>
       <w:tcPr>
@@ -2748,7 +3156,7 @@
       <w:rPr>
         <w:b/>
         <w:bCs/>
-        <w:color w:val="FFFFFF" w:themeColor="background1"/>
+        <w:color w:val="000000"/>
       </w:rPr>
       <w:tblPr/>
       <w:tcPr>
@@ -2840,7 +3248,7 @@
       <w:rPr>
         <w:b/>
         <w:bCs/>
-        <w:color w:val="FFFFFF" w:themeColor="background1"/>
+        <w:color w:val="000000"/>
       </w:rPr>
       <w:tblPr/>
       <w:tcPr>
@@ -2932,7 +3340,7 @@
       <w:rPr>
         <w:b/>
         <w:bCs/>
-        <w:color w:val="FFFFFF" w:themeColor="background1"/>
+        <w:color w:val="000000"/>
       </w:rPr>
       <w:tblPr/>
       <w:tcPr>
@@ -3024,7 +3432,7 @@
       <w:rPr>
         <w:b/>
         <w:bCs/>
-        <w:color w:val="FFFFFF" w:themeColor="background1"/>
+        <w:color w:val="000000"/>
       </w:rPr>
       <w:tblPr/>
       <w:tcPr>
@@ -3116,7 +3524,7 @@
       <w:rPr>
         <w:b/>
         <w:bCs/>
-        <w:color w:val="FFFFFF" w:themeColor="background1"/>
+        <w:color w:val="000000"/>
       </w:rPr>
       <w:tblPr/>
       <w:tcPr>
@@ -3208,7 +3616,7 @@
       <w:rPr>
         <w:b/>
         <w:bCs/>
-        <w:color w:val="FFFFFF" w:themeColor="background1"/>
+        <w:color w:val="000000"/>
       </w:rPr>
       <w:tblPr/>
       <w:tcPr>
@@ -4211,7 +4619,7 @@
       <w:rPr>
         <w:b/>
         <w:bCs/>
-        <w:color w:val="FFFFFF" w:themeColor="background1"/>
+        <w:color w:val="000000"/>
       </w:rPr>
       <w:tblPr/>
       <w:tcPr>
@@ -4317,7 +4725,7 @@
       <w:rPr>
         <w:b/>
         <w:bCs/>
-        <w:color w:val="FFFFFF" w:themeColor="background1"/>
+        <w:color w:val="000000"/>
       </w:rPr>
       <w:tblPr/>
       <w:tcPr>
@@ -4423,7 +4831,7 @@
       <w:rPr>
         <w:b/>
         <w:bCs/>
-        <w:color w:val="FFFFFF" w:themeColor="background1"/>
+        <w:color w:val="000000"/>
       </w:rPr>
       <w:tblPr/>
       <w:tcPr>
@@ -4529,7 +4937,7 @@
       <w:rPr>
         <w:b/>
         <w:bCs/>
-        <w:color w:val="FFFFFF" w:themeColor="background1"/>
+        <w:color w:val="000000"/>
       </w:rPr>
       <w:tblPr/>
       <w:tcPr>
@@ -4635,7 +5043,7 @@
       <w:rPr>
         <w:b/>
         <w:bCs/>
-        <w:color w:val="FFFFFF" w:themeColor="background1"/>
+        <w:color w:val="000000"/>
       </w:rPr>
       <w:tblPr/>
       <w:tcPr>
@@ -4741,7 +5149,7 @@
       <w:rPr>
         <w:b/>
         <w:bCs/>
-        <w:color w:val="FFFFFF" w:themeColor="background1"/>
+        <w:color w:val="000000"/>
       </w:rPr>
       <w:tblPr/>
       <w:tcPr>
@@ -4847,7 +5255,7 @@
       <w:rPr>
         <w:b/>
         <w:bCs/>
-        <w:color w:val="FFFFFF" w:themeColor="background1"/>
+        <w:color w:val="000000"/>
       </w:rPr>
       <w:tblPr/>
       <w:tcPr>
@@ -4950,7 +5358,7 @@
       <w:rPr>
         <w:b/>
         <w:bCs/>
-        <w:color w:val="FFFFFF" w:themeColor="background1"/>
+        <w:color w:val="000000"/>
       </w:rPr>
       <w:tblPr/>
       <w:tcPr>
@@ -4970,7 +5378,7 @@
         <w:spacing w:before="0" w:after="0" w:line="240" w:lineRule="auto"/>
       </w:pPr>
       <w:rPr>
-        <w:color w:val="auto"/>
+        <w:color w:val="000000"/>
       </w:rPr>
       <w:tblPr/>
       <w:tcPr>
@@ -4989,7 +5397,7 @@
       <w:rPr>
         <w:b/>
         <w:bCs/>
-        <w:color w:val="FFFFFF" w:themeColor="background1"/>
+        <w:color w:val="000000"/>
       </w:rPr>
       <w:tblPr/>
       <w:tcPr>
@@ -5008,7 +5416,7 @@
       <w:rPr>
         <w:b/>
         <w:bCs/>
-        <w:color w:val="FFFFFF" w:themeColor="background1"/>
+        <w:color w:val="000000"/>
       </w:rPr>
       <w:tblPr/>
       <w:tcPr>
@@ -5054,7 +5462,7 @@
     </w:tblStylePr>
     <w:tblStylePr w:type="nwCell">
       <w:rPr>
-        <w:color w:val="FFFFFF" w:themeColor="background1"/>
+        <w:color w:val="000000"/>
       </w:rPr>
       <w:tblPr/>
       <w:tcPr>
@@ -5099,7 +5507,7 @@
       <w:rPr>
         <w:b/>
         <w:bCs/>
-        <w:color w:val="FFFFFF" w:themeColor="background1"/>
+        <w:color w:val="000000"/>
       </w:rPr>
       <w:tblPr/>
       <w:tcPr>
@@ -5119,7 +5527,7 @@
         <w:spacing w:before="0" w:after="0" w:line="240" w:lineRule="auto"/>
       </w:pPr>
       <w:rPr>
-        <w:color w:val="auto"/>
+        <w:color w:val="000000"/>
       </w:rPr>
       <w:tblPr/>
       <w:tcPr>
@@ -5138,7 +5546,7 @@
       <w:rPr>
         <w:b/>
         <w:bCs/>
-        <w:color w:val="FFFFFF" w:themeColor="background1"/>
+        <w:color w:val="000000"/>
       </w:rPr>
       <w:tblPr/>
       <w:tcPr>
@@ -5157,7 +5565,7 @@
       <w:rPr>
         <w:b/>
         <w:bCs/>
-        <w:color w:val="FFFFFF" w:themeColor="background1"/>
+        <w:color w:val="000000"/>
       </w:rPr>
       <w:tblPr/>
       <w:tcPr>
@@ -5203,7 +5611,7 @@
     </w:tblStylePr>
     <w:tblStylePr w:type="nwCell">
       <w:rPr>
-        <w:color w:val="FFFFFF" w:themeColor="background1"/>
+        <w:color w:val="000000"/>
       </w:rPr>
       <w:tblPr/>
       <w:tcPr>
@@ -5248,7 +5656,7 @@
       <w:rPr>
         <w:b/>
         <w:bCs/>
-        <w:color w:val="FFFFFF" w:themeColor="background1"/>
+        <w:color w:val="000000"/>
       </w:rPr>
       <w:tblPr/>
       <w:tcPr>
@@ -5268,7 +5676,7 @@
         <w:spacing w:before="0" w:after="0" w:line="240" w:lineRule="auto"/>
       </w:pPr>
       <w:rPr>
-        <w:color w:val="auto"/>
+        <w:color w:val="000000"/>
       </w:rPr>
       <w:tblPr/>
       <w:tcPr>
@@ -5287,7 +5695,7 @@
       <w:rPr>
         <w:b/>
         <w:bCs/>
-        <w:color w:val="FFFFFF" w:themeColor="background1"/>
+        <w:color w:val="000000"/>
       </w:rPr>
       <w:tblPr/>
       <w:tcPr>
@@ -5306,7 +5714,7 @@
       <w:rPr>
         <w:b/>
         <w:bCs/>
-        <w:color w:val="FFFFFF" w:themeColor="background1"/>
+        <w:color w:val="000000"/>
       </w:rPr>
       <w:tblPr/>
       <w:tcPr>
@@ -5352,7 +5760,7 @@
     </w:tblStylePr>
     <w:tblStylePr w:type="nwCell">
       <w:rPr>
-        <w:color w:val="FFFFFF" w:themeColor="background1"/>
+        <w:color w:val="000000"/>
       </w:rPr>
       <w:tblPr/>
       <w:tcPr>
@@ -5397,7 +5805,7 @@
       <w:rPr>
         <w:b/>
         <w:bCs/>
-        <w:color w:val="FFFFFF" w:themeColor="background1"/>
+        <w:color w:val="000000"/>
       </w:rPr>
       <w:tblPr/>
       <w:tcPr>
@@ -5417,7 +5825,7 @@
         <w:spacing w:before="0" w:after="0" w:line="240" w:lineRule="auto"/>
       </w:pPr>
       <w:rPr>
-        <w:color w:val="auto"/>
+        <w:color w:val="000000"/>
       </w:rPr>
       <w:tblPr/>
       <w:tcPr>
@@ -5436,7 +5844,7 @@
       <w:rPr>
         <w:b/>
         <w:bCs/>
-        <w:color w:val="FFFFFF" w:themeColor="background1"/>
+        <w:color w:val="000000"/>
       </w:rPr>
       <w:tblPr/>
       <w:tcPr>
@@ -5455,7 +5863,7 @@
       <w:rPr>
         <w:b/>
         <w:bCs/>
-        <w:color w:val="FFFFFF" w:themeColor="background1"/>
+        <w:color w:val="000000"/>
       </w:rPr>
       <w:tblPr/>
       <w:tcPr>
@@ -5501,7 +5909,7 @@
     </w:tblStylePr>
     <w:tblStylePr w:type="nwCell">
       <w:rPr>
-        <w:color w:val="FFFFFF" w:themeColor="background1"/>
+        <w:color w:val="000000"/>
       </w:rPr>
       <w:tblPr/>
       <w:tcPr>
@@ -5546,7 +5954,7 @@
       <w:rPr>
         <w:b/>
         <w:bCs/>
-        <w:color w:val="FFFFFF" w:themeColor="background1"/>
+        <w:color w:val="000000"/>
       </w:rPr>
       <w:tblPr/>
       <w:tcPr>
@@ -5566,7 +5974,7 @@
         <w:spacing w:before="0" w:after="0" w:line="240" w:lineRule="auto"/>
       </w:pPr>
       <w:rPr>
-        <w:color w:val="auto"/>
+        <w:color w:val="000000"/>
       </w:rPr>
       <w:tblPr/>
       <w:tcPr>
@@ -5585,7 +5993,7 @@
       <w:rPr>
         <w:b/>
         <w:bCs/>
-        <w:color w:val="FFFFFF" w:themeColor="background1"/>
+        <w:color w:val="000000"/>
       </w:rPr>
       <w:tblPr/>
       <w:tcPr>
@@ -5604,7 +6012,7 @@
       <w:rPr>
         <w:b/>
         <w:bCs/>
-        <w:color w:val="FFFFFF" w:themeColor="background1"/>
+        <w:color w:val="000000"/>
       </w:rPr>
       <w:tblPr/>
       <w:tcPr>
@@ -5650,7 +6058,7 @@
     </w:tblStylePr>
     <w:tblStylePr w:type="nwCell">
       <w:rPr>
-        <w:color w:val="FFFFFF" w:themeColor="background1"/>
+        <w:color w:val="000000"/>
       </w:rPr>
       <w:tblPr/>
       <w:tcPr>
@@ -5695,7 +6103,7 @@
       <w:rPr>
         <w:b/>
         <w:bCs/>
-        <w:color w:val="FFFFFF" w:themeColor="background1"/>
+        <w:color w:val="000000"/>
       </w:rPr>
       <w:tblPr/>
       <w:tcPr>
@@ -5715,7 +6123,7 @@
         <w:spacing w:before="0" w:after="0" w:line="240" w:lineRule="auto"/>
       </w:pPr>
       <w:rPr>
-        <w:color w:val="auto"/>
+        <w:color w:val="000000"/>
       </w:rPr>
       <w:tblPr/>
       <w:tcPr>
@@ -5734,7 +6142,7 @@
       <w:rPr>
         <w:b/>
         <w:bCs/>
-        <w:color w:val="FFFFFF" w:themeColor="background1"/>
+        <w:color w:val="000000"/>
       </w:rPr>
       <w:tblPr/>
       <w:tcPr>
@@ -5753,7 +6161,7 @@
       <w:rPr>
         <w:b/>
         <w:bCs/>
-        <w:color w:val="FFFFFF" w:themeColor="background1"/>
+        <w:color w:val="000000"/>
       </w:rPr>
       <w:tblPr/>
       <w:tcPr>
@@ -5799,7 +6207,7 @@
     </w:tblStylePr>
     <w:tblStylePr w:type="nwCell">
       <w:rPr>
-        <w:color w:val="FFFFFF" w:themeColor="background1"/>
+        <w:color w:val="000000"/>
       </w:rPr>
       <w:tblPr/>
       <w:tcPr>
@@ -5844,7 +6252,7 @@
       <w:rPr>
         <w:b/>
         <w:bCs/>
-        <w:color w:val="FFFFFF" w:themeColor="background1"/>
+        <w:color w:val="000000"/>
       </w:rPr>
       <w:tblPr/>
       <w:tcPr>
@@ -5864,7 +6272,7 @@
         <w:spacing w:before="0" w:after="0" w:line="240" w:lineRule="auto"/>
       </w:pPr>
       <w:rPr>
-        <w:color w:val="auto"/>
+        <w:color w:val="000000"/>
       </w:rPr>
       <w:tblPr/>
       <w:tcPr>
@@ -5883,7 +6291,7 @@
       <w:rPr>
         <w:b/>
         <w:bCs/>
-        <w:color w:val="FFFFFF" w:themeColor="background1"/>
+        <w:color w:val="000000"/>
       </w:rPr>
       <w:tblPr/>
       <w:tcPr>
@@ -5902,7 +6310,7 @@
       <w:rPr>
         <w:b/>
         <w:bCs/>
-        <w:color w:val="FFFFFF" w:themeColor="background1"/>
+        <w:color w:val="000000"/>
       </w:rPr>
       <w:tblPr/>
       <w:tcPr>
@@ -5948,7 +6356,7 @@
     </w:tblStylePr>
     <w:tblStylePr w:type="nwCell">
       <w:rPr>
-        <w:color w:val="FFFFFF" w:themeColor="background1"/>
+        <w:color w:val="000000"/>
       </w:rPr>
       <w:tblPr/>
       <w:tcPr>
@@ -5972,7 +6380,7 @@
       <w:spacing w:after="0" w:line="240" w:lineRule="auto"/>
     </w:pPr>
     <w:rPr>
-      <w:color w:val="000000" w:themeColor="text1"/>
+      <w:color w:val="000000"/>
     </w:rPr>
     <w:tblPr>
       <w:tblStyleRowBandSize w:val="1"/>
@@ -6005,7 +6413,7 @@
       <w:rPr>
         <w:b/>
         <w:bCs/>
-        <w:color w:val="1F497D" w:themeColor="text2"/>
+        <w:color w:val="000000"/>
       </w:rPr>
       <w:tblPr/>
       <w:tcPr>
@@ -6056,7 +6464,7 @@
       <w:spacing w:after="0" w:line="240" w:lineRule="auto"/>
     </w:pPr>
     <w:rPr>
-      <w:color w:val="000000" w:themeColor="text1"/>
+      <w:color w:val="000000"/>
     </w:rPr>
     <w:tblPr>
       <w:tblStyleRowBandSize w:val="1"/>
@@ -6089,7 +6497,7 @@
       <w:rPr>
         <w:b/>
         <w:bCs/>
-        <w:color w:val="1F497D" w:themeColor="text2"/>
+        <w:color w:val="000000"/>
       </w:rPr>
       <w:tblPr/>
       <w:tcPr>
@@ -6140,7 +6548,7 @@
       <w:spacing w:after="0" w:line="240" w:lineRule="auto"/>
     </w:pPr>
     <w:rPr>
-      <w:color w:val="000000" w:themeColor="text1"/>
+      <w:color w:val="000000"/>
     </w:rPr>
     <w:tblPr>
       <w:tblStyleRowBandSize w:val="1"/>
@@ -6173,7 +6581,7 @@
       <w:rPr>
         <w:b/>
         <w:bCs/>
-        <w:color w:val="1F497D" w:themeColor="text2"/>
+        <w:color w:val="000000"/>
       </w:rPr>
       <w:tblPr/>
       <w:tcPr>
@@ -6224,7 +6632,7 @@
       <w:spacing w:after="0" w:line="240" w:lineRule="auto"/>
     </w:pPr>
     <w:rPr>
-      <w:color w:val="000000" w:themeColor="text1"/>
+      <w:color w:val="000000"/>
     </w:rPr>
     <w:tblPr>
       <w:tblStyleRowBandSize w:val="1"/>
@@ -6257,7 +6665,7 @@
       <w:rPr>
         <w:b/>
         <w:bCs/>
-        <w:color w:val="1F497D" w:themeColor="text2"/>
+        <w:color w:val="000000"/>
       </w:rPr>
       <w:tblPr/>
       <w:tcPr>
@@ -6308,7 +6716,7 @@
       <w:spacing w:after="0" w:line="240" w:lineRule="auto"/>
     </w:pPr>
     <w:rPr>
-      <w:color w:val="000000" w:themeColor="text1"/>
+      <w:color w:val="000000"/>
     </w:rPr>
     <w:tblPr>
       <w:tblStyleRowBandSize w:val="1"/>
@@ -6341,7 +6749,7 @@
       <w:rPr>
         <w:b/>
         <w:bCs/>
-        <w:color w:val="1F497D" w:themeColor="text2"/>
+        <w:color w:val="000000"/>
       </w:rPr>
       <w:tblPr/>
       <w:tcPr>
@@ -6392,7 +6800,7 @@
       <w:spacing w:after="0" w:line="240" w:lineRule="auto"/>
     </w:pPr>
     <w:rPr>
-      <w:color w:val="000000" w:themeColor="text1"/>
+      <w:color w:val="000000"/>
     </w:rPr>
     <w:tblPr>
       <w:tblStyleRowBandSize w:val="1"/>
@@ -6425,7 +6833,7 @@
       <w:rPr>
         <w:b/>
         <w:bCs/>
-        <w:color w:val="1F497D" w:themeColor="text2"/>
+        <w:color w:val="000000"/>
       </w:rPr>
       <w:tblPr/>
       <w:tcPr>
@@ -6476,7 +6884,7 @@
       <w:spacing w:after="0" w:line="240" w:lineRule="auto"/>
     </w:pPr>
     <w:rPr>
-      <w:color w:val="000000" w:themeColor="text1"/>
+      <w:color w:val="000000"/>
     </w:rPr>
     <w:tblPr>
       <w:tblStyleRowBandSize w:val="1"/>
@@ -6509,7 +6917,7 @@
       <w:rPr>
         <w:b/>
         <w:bCs/>
-        <w:color w:val="1F497D" w:themeColor="text2"/>
+        <w:color w:val="000000"/>
       </w:rPr>
       <w:tblPr/>
       <w:tcPr>
@@ -6561,7 +6969,7 @@
     </w:pPr>
     <w:rPr>
       <w:rFonts w:asciiTheme="majorHAnsi" w:eastAsiaTheme="majorEastAsia" w:hAnsiTheme="majorHAnsi" w:cstheme="majorBidi"/>
-      <w:color w:val="000000" w:themeColor="text1"/>
+      <w:color w:val="000000"/>
     </w:rPr>
     <w:tblPr>
       <w:tblStyleRowBandSize w:val="1"/>
@@ -6689,7 +7097,7 @@
     </w:pPr>
     <w:rPr>
       <w:rFonts w:asciiTheme="majorHAnsi" w:eastAsiaTheme="majorEastAsia" w:hAnsiTheme="majorHAnsi" w:cstheme="majorBidi"/>
-      <w:color w:val="000000" w:themeColor="text1"/>
+      <w:color w:val="000000"/>
     </w:rPr>
     <w:tblPr>
       <w:tblStyleRowBandSize w:val="1"/>
@@ -6817,7 +7225,7 @@
     </w:pPr>
     <w:rPr>
       <w:rFonts w:asciiTheme="majorHAnsi" w:eastAsiaTheme="majorEastAsia" w:hAnsiTheme="majorHAnsi" w:cstheme="majorBidi"/>
-      <w:color w:val="000000" w:themeColor="text1"/>
+      <w:color w:val="000000"/>
     </w:rPr>
     <w:tblPr>
       <w:tblStyleRowBandSize w:val="1"/>
@@ -6945,7 +7353,7 @@
     </w:pPr>
     <w:rPr>
       <w:rFonts w:asciiTheme="majorHAnsi" w:eastAsiaTheme="majorEastAsia" w:hAnsiTheme="majorHAnsi" w:cstheme="majorBidi"/>
-      <w:color w:val="000000" w:themeColor="text1"/>
+      <w:color w:val="000000"/>
     </w:rPr>
     <w:tblPr>
       <w:tblStyleRowBandSize w:val="1"/>
@@ -7073,7 +7481,7 @@
     </w:pPr>
     <w:rPr>
       <w:rFonts w:asciiTheme="majorHAnsi" w:eastAsiaTheme="majorEastAsia" w:hAnsiTheme="majorHAnsi" w:cstheme="majorBidi"/>
-      <w:color w:val="000000" w:themeColor="text1"/>
+      <w:color w:val="000000"/>
     </w:rPr>
     <w:tblPr>
       <w:tblStyleRowBandSize w:val="1"/>
@@ -7201,7 +7609,7 @@
     </w:pPr>
     <w:rPr>
       <w:rFonts w:asciiTheme="majorHAnsi" w:eastAsiaTheme="majorEastAsia" w:hAnsiTheme="majorHAnsi" w:cstheme="majorBidi"/>
-      <w:color w:val="000000" w:themeColor="text1"/>
+      <w:color w:val="000000"/>
     </w:rPr>
     <w:tblPr>
       <w:tblStyleRowBandSize w:val="1"/>
@@ -7329,7 +7737,7 @@
     </w:pPr>
     <w:rPr>
       <w:rFonts w:asciiTheme="majorHAnsi" w:eastAsiaTheme="majorEastAsia" w:hAnsiTheme="majorHAnsi" w:cstheme="majorBidi"/>
-      <w:color w:val="000000" w:themeColor="text1"/>
+      <w:color w:val="000000"/>
     </w:rPr>
     <w:tblPr>
       <w:tblStyleRowBandSize w:val="1"/>
@@ -7968,7 +8376,7 @@
     </w:pPr>
     <w:rPr>
       <w:rFonts w:asciiTheme="majorHAnsi" w:eastAsiaTheme="majorEastAsia" w:hAnsiTheme="majorHAnsi" w:cstheme="majorBidi"/>
-      <w:color w:val="000000" w:themeColor="text1"/>
+      <w:color w:val="000000"/>
     </w:rPr>
     <w:tblPr>
       <w:tblStyleRowBandSize w:val="1"/>
@@ -7996,7 +8404,7 @@
       <w:rPr>
         <w:b/>
         <w:bCs/>
-        <w:color w:val="000000" w:themeColor="text1"/>
+        <w:color w:val="000000"/>
       </w:rPr>
       <w:tblPr/>
       <w:tcPr>
@@ -8007,7 +8415,7 @@
       <w:rPr>
         <w:b/>
         <w:bCs/>
-        <w:color w:val="000000" w:themeColor="text1"/>
+        <w:color w:val="000000"/>
       </w:rPr>
       <w:tblPr/>
       <w:tcPr>
@@ -8026,7 +8434,7 @@
       <w:rPr>
         <w:b/>
         <w:bCs/>
-        <w:color w:val="000000" w:themeColor="text1"/>
+        <w:color w:val="000000"/>
       </w:rPr>
       <w:tblPr/>
       <w:tcPr>
@@ -8045,7 +8453,7 @@
       <w:rPr>
         <w:b w:val="0"/>
         <w:bCs w:val="0"/>
-        <w:color w:val="000000" w:themeColor="text1"/>
+        <w:color w:val="000000"/>
       </w:rPr>
       <w:tblPr/>
       <w:tcPr>
@@ -8093,7 +8501,7 @@
     </w:pPr>
     <w:rPr>
       <w:rFonts w:asciiTheme="majorHAnsi" w:eastAsiaTheme="majorEastAsia" w:hAnsiTheme="majorHAnsi" w:cstheme="majorBidi"/>
-      <w:color w:val="000000" w:themeColor="text1"/>
+      <w:color w:val="000000"/>
     </w:rPr>
     <w:tblPr>
       <w:tblStyleRowBandSize w:val="1"/>
@@ -8121,7 +8529,7 @@
       <w:rPr>
         <w:b/>
         <w:bCs/>
-        <w:color w:val="000000" w:themeColor="text1"/>
+        <w:color w:val="000000"/>
       </w:rPr>
       <w:tblPr/>
       <w:tcPr>
@@ -8132,7 +8540,7 @@
       <w:rPr>
         <w:b/>
         <w:bCs/>
-        <w:color w:val="000000" w:themeColor="text1"/>
+        <w:color w:val="000000"/>
       </w:rPr>
       <w:tblPr/>
       <w:tcPr>
@@ -8151,7 +8559,7 @@
       <w:rPr>
         <w:b/>
         <w:bCs/>
-        <w:color w:val="000000" w:themeColor="text1"/>
+        <w:color w:val="000000"/>
       </w:rPr>
       <w:tblPr/>
       <w:tcPr>
@@ -8170,7 +8578,7 @@
       <w:rPr>
         <w:b w:val="0"/>
         <w:bCs w:val="0"/>
-        <w:color w:val="000000" w:themeColor="text1"/>
+        <w:color w:val="000000"/>
       </w:rPr>
       <w:tblPr/>
       <w:tcPr>
@@ -8218,7 +8626,7 @@
     </w:pPr>
     <w:rPr>
       <w:rFonts w:asciiTheme="majorHAnsi" w:eastAsiaTheme="majorEastAsia" w:hAnsiTheme="majorHAnsi" w:cstheme="majorBidi"/>
-      <w:color w:val="000000" w:themeColor="text1"/>
+      <w:color w:val="000000"/>
     </w:rPr>
     <w:tblPr>
       <w:tblStyleRowBandSize w:val="1"/>
@@ -8246,7 +8654,7 @@
       <w:rPr>
         <w:b/>
         <w:bCs/>
-        <w:color w:val="000000" w:themeColor="text1"/>
+        <w:color w:val="000000"/>
       </w:rPr>
       <w:tblPr/>
       <w:tcPr>
@@ -8257,7 +8665,7 @@
       <w:rPr>
         <w:b/>
         <w:bCs/>
-        <w:color w:val="000000" w:themeColor="text1"/>
+        <w:color w:val="000000"/>
       </w:rPr>
       <w:tblPr/>
       <w:tcPr>
@@ -8276,7 +8684,7 @@
       <w:rPr>
         <w:b/>
         <w:bCs/>
-        <w:color w:val="000000" w:themeColor="text1"/>
+        <w:color w:val="000000"/>
       </w:rPr>
       <w:tblPr/>
       <w:tcPr>
@@ -8295,7 +8703,7 @@
       <w:rPr>
         <w:b w:val="0"/>
         <w:bCs w:val="0"/>
-        <w:color w:val="000000" w:themeColor="text1"/>
+        <w:color w:val="000000"/>
       </w:rPr>
       <w:tblPr/>
       <w:tcPr>
@@ -8343,7 +8751,7 @@
     </w:pPr>
     <w:rPr>
       <w:rFonts w:asciiTheme="majorHAnsi" w:eastAsiaTheme="majorEastAsia" w:hAnsiTheme="majorHAnsi" w:cstheme="majorBidi"/>
-      <w:color w:val="000000" w:themeColor="text1"/>
+      <w:color w:val="000000"/>
     </w:rPr>
     <w:tblPr>
       <w:tblStyleRowBandSize w:val="1"/>
@@ -8371,7 +8779,7 @@
       <w:rPr>
         <w:b/>
         <w:bCs/>
-        <w:color w:val="000000" w:themeColor="text1"/>
+        <w:color w:val="000000"/>
       </w:rPr>
       <w:tblPr/>
       <w:tcPr>
@@ -8382,7 +8790,7 @@
       <w:rPr>
         <w:b/>
         <w:bCs/>
-        <w:color w:val="000000" w:themeColor="text1"/>
+        <w:color w:val="000000"/>
       </w:rPr>
       <w:tblPr/>
       <w:tcPr>
@@ -8401,7 +8809,7 @@
       <w:rPr>
         <w:b/>
         <w:bCs/>
-        <w:color w:val="000000" w:themeColor="text1"/>
+        <w:color w:val="000000"/>
       </w:rPr>
       <w:tblPr/>
       <w:tcPr>
@@ -8420,7 +8828,7 @@
       <w:rPr>
         <w:b w:val="0"/>
         <w:bCs w:val="0"/>
-        <w:color w:val="000000" w:themeColor="text1"/>
+        <w:color w:val="000000"/>
       </w:rPr>
       <w:tblPr/>
       <w:tcPr>
@@ -8468,7 +8876,7 @@
     </w:pPr>
     <w:rPr>
       <w:rFonts w:asciiTheme="majorHAnsi" w:eastAsiaTheme="majorEastAsia" w:hAnsiTheme="majorHAnsi" w:cstheme="majorBidi"/>
-      <w:color w:val="000000" w:themeColor="text1"/>
+      <w:color w:val="000000"/>
     </w:rPr>
     <w:tblPr>
       <w:tblStyleRowBandSize w:val="1"/>
@@ -8496,7 +8904,7 @@
       <w:rPr>
         <w:b/>
         <w:bCs/>
-        <w:color w:val="000000" w:themeColor="text1"/>
+        <w:color w:val="000000"/>
       </w:rPr>
       <w:tblPr/>
       <w:tcPr>
@@ -8507,7 +8915,7 @@
       <w:rPr>
         <w:b/>
         <w:bCs/>
-        <w:color w:val="000000" w:themeColor="text1"/>
+        <w:color w:val="000000"/>
       </w:rPr>
       <w:tblPr/>
       <w:tcPr>
@@ -8526,7 +8934,7 @@
       <w:rPr>
         <w:b/>
         <w:bCs/>
-        <w:color w:val="000000" w:themeColor="text1"/>
+        <w:color w:val="000000"/>
       </w:rPr>
       <w:tblPr/>
       <w:tcPr>
@@ -8545,7 +8953,7 @@
       <w:rPr>
         <w:b w:val="0"/>
         <w:bCs w:val="0"/>
-        <w:color w:val="000000" w:themeColor="text1"/>
+        <w:color w:val="000000"/>
       </w:rPr>
       <w:tblPr/>
       <w:tcPr>
@@ -8593,7 +9001,7 @@
     </w:pPr>
     <w:rPr>
       <w:rFonts w:asciiTheme="majorHAnsi" w:eastAsiaTheme="majorEastAsia" w:hAnsiTheme="majorHAnsi" w:cstheme="majorBidi"/>
-      <w:color w:val="000000" w:themeColor="text1"/>
+      <w:color w:val="000000"/>
     </w:rPr>
     <w:tblPr>
       <w:tblStyleRowBandSize w:val="1"/>
@@ -8621,7 +9029,7 @@
       <w:rPr>
         <w:b/>
         <w:bCs/>
-        <w:color w:val="000000" w:themeColor="text1"/>
+        <w:color w:val="000000"/>
       </w:rPr>
       <w:tblPr/>
       <w:tcPr>
@@ -8632,7 +9040,7 @@
       <w:rPr>
         <w:b/>
         <w:bCs/>
-        <w:color w:val="000000" w:themeColor="text1"/>
+        <w:color w:val="000000"/>
       </w:rPr>
       <w:tblPr/>
       <w:tcPr>
@@ -8651,7 +9059,7 @@
       <w:rPr>
         <w:b/>
         <w:bCs/>
-        <w:color w:val="000000" w:themeColor="text1"/>
+        <w:color w:val="000000"/>
       </w:rPr>
       <w:tblPr/>
       <w:tcPr>
@@ -8670,7 +9078,7 @@
       <w:rPr>
         <w:b w:val="0"/>
         <w:bCs w:val="0"/>
-        <w:color w:val="000000" w:themeColor="text1"/>
+        <w:color w:val="000000"/>
       </w:rPr>
       <w:tblPr/>
       <w:tcPr>
@@ -8718,7 +9126,7 @@
     </w:pPr>
     <w:rPr>
       <w:rFonts w:asciiTheme="majorHAnsi" w:eastAsiaTheme="majorEastAsia" w:hAnsiTheme="majorHAnsi" w:cstheme="majorBidi"/>
-      <w:color w:val="000000" w:themeColor="text1"/>
+      <w:color w:val="000000"/>
     </w:rPr>
     <w:tblPr>
       <w:tblStyleRowBandSize w:val="1"/>
@@ -8746,7 +9154,7 @@
       <w:rPr>
         <w:b/>
         <w:bCs/>
-        <w:color w:val="000000" w:themeColor="text1"/>
+        <w:color w:val="000000"/>
       </w:rPr>
       <w:tblPr/>
       <w:tcPr>
@@ -8757,7 +9165,7 @@
       <w:rPr>
         <w:b/>
         <w:bCs/>
-        <w:color w:val="000000" w:themeColor="text1"/>
+        <w:color w:val="000000"/>
       </w:rPr>
       <w:tblPr/>
       <w:tcPr>
@@ -8776,7 +9184,7 @@
       <w:rPr>
         <w:b/>
         <w:bCs/>
-        <w:color w:val="000000" w:themeColor="text1"/>
+        <w:color w:val="000000"/>
       </w:rPr>
       <w:tblPr/>
       <w:tcPr>
@@ -8795,7 +9203,7 @@
       <w:rPr>
         <w:b w:val="0"/>
         <w:bCs w:val="0"/>
-        <w:color w:val="000000" w:themeColor="text1"/>
+        <w:color w:val="000000"/>
       </w:rPr>
       <w:tblPr/>
       <w:tcPr>
@@ -8869,7 +9277,7 @@
         <w:bCs/>
         <w:i w:val="0"/>
         <w:iCs w:val="0"/>
-        <w:color w:val="FFFFFF" w:themeColor="background1"/>
+        <w:color w:val="000000"/>
       </w:rPr>
       <w:tblPr/>
       <w:tcPr>
@@ -8890,7 +9298,7 @@
         <w:bCs/>
         <w:i w:val="0"/>
         <w:iCs w:val="0"/>
-        <w:color w:val="FFFFFF" w:themeColor="background1"/>
+        <w:color w:val="000000"/>
       </w:rPr>
       <w:tblPr/>
       <w:tcPr>
@@ -8911,7 +9319,7 @@
         <w:bCs/>
         <w:i w:val="0"/>
         <w:iCs w:val="0"/>
-        <w:color w:val="FFFFFF" w:themeColor="background1"/>
+        <w:color w:val="000000"/>
       </w:rPr>
       <w:tblPr/>
       <w:tcPr>
@@ -8930,7 +9338,7 @@
         <w:bCs/>
         <w:i w:val="0"/>
         <w:iCs w:val="0"/>
-        <w:color w:val="FFFFFF" w:themeColor="background1"/>
+        <w:color w:val="000000"/>
       </w:rPr>
       <w:tblPr/>
       <w:tcPr>
@@ -9010,7 +9418,7 @@
         <w:bCs/>
         <w:i w:val="0"/>
         <w:iCs w:val="0"/>
-        <w:color w:val="FFFFFF" w:themeColor="background1"/>
+        <w:color w:val="000000"/>
       </w:rPr>
       <w:tblPr/>
       <w:tcPr>
@@ -9031,7 +9439,7 @@
         <w:bCs/>
         <w:i w:val="0"/>
         <w:iCs w:val="0"/>
-        <w:color w:val="FFFFFF" w:themeColor="background1"/>
+        <w:color w:val="000000"/>
       </w:rPr>
       <w:tblPr/>
       <w:tcPr>
@@ -9052,7 +9460,7 @@
         <w:bCs/>
         <w:i w:val="0"/>
         <w:iCs w:val="0"/>
-        <w:color w:val="FFFFFF" w:themeColor="background1"/>
+        <w:color w:val="000000"/>
       </w:rPr>
       <w:tblPr/>
       <w:tcPr>
@@ -9071,7 +9479,7 @@
         <w:bCs/>
         <w:i w:val="0"/>
         <w:iCs w:val="0"/>
-        <w:color w:val="FFFFFF" w:themeColor="background1"/>
+        <w:color w:val="000000"/>
       </w:rPr>
       <w:tblPr/>
       <w:tcPr>
@@ -9151,7 +9559,7 @@
         <w:bCs/>
         <w:i w:val="0"/>
         <w:iCs w:val="0"/>
-        <w:color w:val="FFFFFF" w:themeColor="background1"/>
+        <w:color w:val="000000"/>
       </w:rPr>
       <w:tblPr/>
       <w:tcPr>
@@ -9172,7 +9580,7 @@
         <w:bCs/>
         <w:i w:val="0"/>
         <w:iCs w:val="0"/>
-        <w:color w:val="FFFFFF" w:themeColor="background1"/>
+        <w:color w:val="000000"/>
       </w:rPr>
       <w:tblPr/>
       <w:tcPr>
@@ -9193,7 +9601,7 @@
         <w:bCs/>
         <w:i w:val="0"/>
         <w:iCs w:val="0"/>
-        <w:color w:val="FFFFFF" w:themeColor="background1"/>
+        <w:color w:val="000000"/>
       </w:rPr>
       <w:tblPr/>
       <w:tcPr>
@@ -9212,7 +9620,7 @@
         <w:bCs/>
         <w:i w:val="0"/>
         <w:iCs w:val="0"/>
-        <w:color w:val="FFFFFF" w:themeColor="background1"/>
+        <w:color w:val="000000"/>
       </w:rPr>
       <w:tblPr/>
       <w:tcPr>
@@ -9292,7 +9700,7 @@
         <w:bCs/>
         <w:i w:val="0"/>
         <w:iCs w:val="0"/>
-        <w:color w:val="FFFFFF" w:themeColor="background1"/>
+        <w:color w:val="000000"/>
       </w:rPr>
       <w:tblPr/>
       <w:tcPr>
@@ -9313,7 +9721,7 @@
         <w:bCs/>
         <w:i w:val="0"/>
         <w:iCs w:val="0"/>
-        <w:color w:val="FFFFFF" w:themeColor="background1"/>
+        <w:color w:val="000000"/>
       </w:rPr>
       <w:tblPr/>
       <w:tcPr>
@@ -9334,7 +9742,7 @@
         <w:bCs/>
         <w:i w:val="0"/>
         <w:iCs w:val="0"/>
-        <w:color w:val="FFFFFF" w:themeColor="background1"/>
+        <w:color w:val="000000"/>
       </w:rPr>
       <w:tblPr/>
       <w:tcPr>
@@ -9353,7 +9761,7 @@
         <w:bCs/>
         <w:i w:val="0"/>
         <w:iCs w:val="0"/>
-        <w:color w:val="FFFFFF" w:themeColor="background1"/>
+        <w:color w:val="000000"/>
       </w:rPr>
       <w:tblPr/>
       <w:tcPr>
@@ -9433,7 +9841,7 @@
         <w:bCs/>
         <w:i w:val="0"/>
         <w:iCs w:val="0"/>
-        <w:color w:val="FFFFFF" w:themeColor="background1"/>
+        <w:color w:val="000000"/>
       </w:rPr>
       <w:tblPr/>
       <w:tcPr>
@@ -9454,7 +9862,7 @@
         <w:bCs/>
         <w:i w:val="0"/>
         <w:iCs w:val="0"/>
-        <w:color w:val="FFFFFF" w:themeColor="background1"/>
+        <w:color w:val="000000"/>
       </w:rPr>
       <w:tblPr/>
       <w:tcPr>
@@ -9475,7 +9883,7 @@
         <w:bCs/>
         <w:i w:val="0"/>
         <w:iCs w:val="0"/>
-        <w:color w:val="FFFFFF" w:themeColor="background1"/>
+        <w:color w:val="000000"/>
       </w:rPr>
       <w:tblPr/>
       <w:tcPr>
@@ -9494,7 +9902,7 @@
         <w:bCs/>
         <w:i w:val="0"/>
         <w:iCs w:val="0"/>
-        <w:color w:val="FFFFFF" w:themeColor="background1"/>
+        <w:color w:val="000000"/>
       </w:rPr>
       <w:tblPr/>
       <w:tcPr>
@@ -9574,7 +9982,7 @@
         <w:bCs/>
         <w:i w:val="0"/>
         <w:iCs w:val="0"/>
-        <w:color w:val="FFFFFF" w:themeColor="background1"/>
+        <w:color w:val="000000"/>
       </w:rPr>
       <w:tblPr/>
       <w:tcPr>
@@ -9595,7 +10003,7 @@
         <w:bCs/>
         <w:i w:val="0"/>
         <w:iCs w:val="0"/>
-        <w:color w:val="FFFFFF" w:themeColor="background1"/>
+        <w:color w:val="000000"/>
       </w:rPr>
       <w:tblPr/>
       <w:tcPr>
@@ -9616,7 +10024,7 @@
         <w:bCs/>
         <w:i w:val="0"/>
         <w:iCs w:val="0"/>
-        <w:color w:val="FFFFFF" w:themeColor="background1"/>
+        <w:color w:val="000000"/>
       </w:rPr>
       <w:tblPr/>
       <w:tcPr>
@@ -9635,7 +10043,7 @@
         <w:bCs/>
         <w:i w:val="0"/>
         <w:iCs w:val="0"/>
-        <w:color w:val="FFFFFF" w:themeColor="background1"/>
+        <w:color w:val="000000"/>
       </w:rPr>
       <w:tblPr/>
       <w:tcPr>
@@ -9715,7 +10123,7 @@
         <w:bCs/>
         <w:i w:val="0"/>
         <w:iCs w:val="0"/>
-        <w:color w:val="FFFFFF" w:themeColor="background1"/>
+        <w:color w:val="000000"/>
       </w:rPr>
       <w:tblPr/>
       <w:tcPr>
@@ -9736,7 +10144,7 @@
         <w:bCs/>
         <w:i w:val="0"/>
         <w:iCs w:val="0"/>
-        <w:color w:val="FFFFFF" w:themeColor="background1"/>
+        <w:color w:val="000000"/>
       </w:rPr>
       <w:tblPr/>
       <w:tcPr>
@@ -9757,7 +10165,7 @@
         <w:bCs/>
         <w:i w:val="0"/>
         <w:iCs w:val="0"/>
-        <w:color w:val="FFFFFF" w:themeColor="background1"/>
+        <w:color w:val="000000"/>
       </w:rPr>
       <w:tblPr/>
       <w:tcPr>
@@ -9776,7 +10184,7 @@
         <w:bCs/>
         <w:i w:val="0"/>
         <w:iCs w:val="0"/>
-        <w:color w:val="FFFFFF" w:themeColor="background1"/>
+        <w:color w:val="000000"/>
       </w:rPr>
       <w:tblPr/>
       <w:tcPr>
@@ -9829,7 +10237,7 @@
       <w:spacing w:after="0" w:line="240" w:lineRule="auto"/>
     </w:pPr>
     <w:rPr>
-      <w:color w:val="FFFFFF" w:themeColor="background1"/>
+      <w:color w:val="000000"/>
     </w:rPr>
     <w:tblPr>
       <w:tblStyleRowBandSize w:val="1"/>
@@ -9943,7 +10351,7 @@
       <w:spacing w:after="0" w:line="240" w:lineRule="auto"/>
     </w:pPr>
     <w:rPr>
-      <w:color w:val="FFFFFF" w:themeColor="background1"/>
+      <w:color w:val="000000"/>
     </w:rPr>
     <w:tblPr>
       <w:tblStyleRowBandSize w:val="1"/>
@@ -10057,7 +10465,7 @@
       <w:spacing w:after="0" w:line="240" w:lineRule="auto"/>
     </w:pPr>
     <w:rPr>
-      <w:color w:val="FFFFFF" w:themeColor="background1"/>
+      <w:color w:val="000000"/>
     </w:rPr>
     <w:tblPr>
       <w:tblStyleRowBandSize w:val="1"/>
@@ -10171,7 +10579,7 @@
       <w:spacing w:after="0" w:line="240" w:lineRule="auto"/>
     </w:pPr>
     <w:rPr>
-      <w:color w:val="FFFFFF" w:themeColor="background1"/>
+      <w:color w:val="000000"/>
     </w:rPr>
     <w:tblPr>
       <w:tblStyleRowBandSize w:val="1"/>
@@ -10285,7 +10693,7 @@
       <w:spacing w:after="0" w:line="240" w:lineRule="auto"/>
     </w:pPr>
     <w:rPr>
-      <w:color w:val="FFFFFF" w:themeColor="background1"/>
+      <w:color w:val="000000"/>
     </w:rPr>
     <w:tblPr>
       <w:tblStyleRowBandSize w:val="1"/>
@@ -10399,7 +10807,7 @@
       <w:spacing w:after="0" w:line="240" w:lineRule="auto"/>
     </w:pPr>
     <w:rPr>
-      <w:color w:val="FFFFFF" w:themeColor="background1"/>
+      <w:color w:val="000000"/>
     </w:rPr>
     <w:tblPr>
       <w:tblStyleRowBandSize w:val="1"/>
@@ -10513,7 +10921,7 @@
       <w:spacing w:after="0" w:line="240" w:lineRule="auto"/>
     </w:pPr>
     <w:rPr>
-      <w:color w:val="FFFFFF" w:themeColor="background1"/>
+      <w:color w:val="000000"/>
     </w:rPr>
     <w:tblPr>
       <w:tblStyleRowBandSize w:val="1"/>
@@ -10627,7 +11035,7 @@
       <w:spacing w:after="0" w:line="240" w:lineRule="auto"/>
     </w:pPr>
     <w:rPr>
-      <w:color w:val="000000" w:themeColor="text1"/>
+      <w:color w:val="000000"/>
     </w:rPr>
     <w:tblPr>
       <w:tblStyleRowBandSize w:val="1"/>
@@ -10673,7 +11081,7 @@
       <w:rPr>
         <w:b/>
         <w:bCs/>
-        <w:color w:val="FFFFFF" w:themeColor="background1"/>
+        <w:color w:val="000000"/>
       </w:rPr>
       <w:tblPr/>
       <w:tcPr>
@@ -10685,7 +11093,7 @@
     </w:tblStylePr>
     <w:tblStylePr w:type="firstCol">
       <w:rPr>
-        <w:color w:val="FFFFFF" w:themeColor="background1"/>
+        <w:color w:val="000000"/>
       </w:rPr>
       <w:tblPr/>
       <w:tcPr>
@@ -10702,7 +11110,7 @@
     </w:tblStylePr>
     <w:tblStylePr w:type="lastCol">
       <w:rPr>
-        <w:color w:val="FFFFFF" w:themeColor="background1"/>
+        <w:color w:val="000000"/>
       </w:rPr>
       <w:tblPr/>
       <w:tcPr>
@@ -10731,12 +11139,12 @@
     </w:tblStylePr>
     <w:tblStylePr w:type="neCell">
       <w:rPr>
-        <w:color w:val="000000" w:themeColor="text1"/>
+        <w:color w:val="000000"/>
       </w:rPr>
     </w:tblStylePr>
     <w:tblStylePr w:type="nwCell">
       <w:rPr>
-        <w:color w:val="000000" w:themeColor="text1"/>
+        <w:color w:val="000000"/>
       </w:rPr>
     </w:tblStylePr>
   </w:style>
@@ -10749,7 +11157,7 @@
       <w:spacing w:after="0" w:line="240" w:lineRule="auto"/>
     </w:pPr>
     <w:rPr>
-      <w:color w:val="000000" w:themeColor="text1"/>
+      <w:color w:val="000000"/>
     </w:rPr>
     <w:tblPr>
       <w:tblStyleRowBandSize w:val="1"/>
@@ -10795,7 +11203,7 @@
       <w:rPr>
         <w:b/>
         <w:bCs/>
-        <w:color w:val="FFFFFF" w:themeColor="background1"/>
+        <w:color w:val="000000"/>
       </w:rPr>
       <w:tblPr/>
       <w:tcPr>
@@ -10807,7 +11215,7 @@
     </w:tblStylePr>
     <w:tblStylePr w:type="firstCol">
       <w:rPr>
-        <w:color w:val="FFFFFF" w:themeColor="background1"/>
+        <w:color w:val="000000"/>
       </w:rPr>
       <w:tblPr/>
       <w:tcPr>
@@ -10824,7 +11232,7 @@
     </w:tblStylePr>
     <w:tblStylePr w:type="lastCol">
       <w:rPr>
-        <w:color w:val="FFFFFF" w:themeColor="background1"/>
+        <w:color w:val="000000"/>
       </w:rPr>
       <w:tblPr/>
       <w:tcPr>
@@ -10853,12 +11261,12 @@
     </w:tblStylePr>
     <w:tblStylePr w:type="neCell">
       <w:rPr>
-        <w:color w:val="000000" w:themeColor="text1"/>
+        <w:color w:val="000000"/>
       </w:rPr>
     </w:tblStylePr>
     <w:tblStylePr w:type="nwCell">
       <w:rPr>
-        <w:color w:val="000000" w:themeColor="text1"/>
+        <w:color w:val="000000"/>
       </w:rPr>
     </w:tblStylePr>
   </w:style>
@@ -10871,7 +11279,7 @@
       <w:spacing w:after="0" w:line="240" w:lineRule="auto"/>
     </w:pPr>
     <w:rPr>
-      <w:color w:val="000000" w:themeColor="text1"/>
+      <w:color w:val="000000"/>
     </w:rPr>
     <w:tblPr>
       <w:tblStyleRowBandSize w:val="1"/>
@@ -10917,7 +11325,7 @@
       <w:rPr>
         <w:b/>
         <w:bCs/>
-        <w:color w:val="FFFFFF" w:themeColor="background1"/>
+        <w:color w:val="000000"/>
       </w:rPr>
       <w:tblPr/>
       <w:tcPr>
@@ -10929,7 +11337,7 @@
     </w:tblStylePr>
     <w:tblStylePr w:type="firstCol">
       <w:rPr>
-        <w:color w:val="FFFFFF" w:themeColor="background1"/>
+        <w:color w:val="000000"/>
       </w:rPr>
       <w:tblPr/>
       <w:tcPr>
@@ -10946,7 +11354,7 @@
     </w:tblStylePr>
     <w:tblStylePr w:type="lastCol">
       <w:rPr>
-        <w:color w:val="FFFFFF" w:themeColor="background1"/>
+        <w:color w:val="000000"/>
       </w:rPr>
       <w:tblPr/>
       <w:tcPr>
@@ -10975,12 +11383,12 @@
     </w:tblStylePr>
     <w:tblStylePr w:type="neCell">
       <w:rPr>
-        <w:color w:val="000000" w:themeColor="text1"/>
+        <w:color w:val="000000"/>
       </w:rPr>
     </w:tblStylePr>
     <w:tblStylePr w:type="nwCell">
       <w:rPr>
-        <w:color w:val="000000" w:themeColor="text1"/>
+        <w:color w:val="000000"/>
       </w:rPr>
     </w:tblStylePr>
   </w:style>
@@ -10993,7 +11401,7 @@
       <w:spacing w:after="0" w:line="240" w:lineRule="auto"/>
     </w:pPr>
     <w:rPr>
-      <w:color w:val="000000" w:themeColor="text1"/>
+      <w:color w:val="000000"/>
     </w:rPr>
     <w:tblPr>
       <w:tblStyleRowBandSize w:val="1"/>
@@ -11039,7 +11447,7 @@
       <w:rPr>
         <w:b/>
         <w:bCs/>
-        <w:color w:val="FFFFFF" w:themeColor="background1"/>
+        <w:color w:val="000000"/>
       </w:rPr>
       <w:tblPr/>
       <w:tcPr>
@@ -11051,7 +11459,7 @@
     </w:tblStylePr>
     <w:tblStylePr w:type="firstCol">
       <w:rPr>
-        <w:color w:val="FFFFFF" w:themeColor="background1"/>
+        <w:color w:val="000000"/>
       </w:rPr>
       <w:tblPr/>
       <w:tcPr>
@@ -11068,7 +11476,7 @@
     </w:tblStylePr>
     <w:tblStylePr w:type="lastCol">
       <w:rPr>
-        <w:color w:val="FFFFFF" w:themeColor="background1"/>
+        <w:color w:val="000000"/>
       </w:rPr>
       <w:tblPr/>
       <w:tcPr>
@@ -11105,7 +11513,7 @@
       <w:spacing w:after="0" w:line="240" w:lineRule="auto"/>
     </w:pPr>
     <w:rPr>
-      <w:color w:val="000000" w:themeColor="text1"/>
+      <w:color w:val="000000"/>
     </w:rPr>
     <w:tblPr>
       <w:tblStyleRowBandSize w:val="1"/>
@@ -11151,7 +11559,7 @@
       <w:rPr>
         <w:b/>
         <w:bCs/>
-        <w:color w:val="FFFFFF" w:themeColor="background1"/>
+        <w:color w:val="000000"/>
       </w:rPr>
       <w:tblPr/>
       <w:tcPr>
@@ -11163,7 +11571,7 @@
     </w:tblStylePr>
     <w:tblStylePr w:type="firstCol">
       <w:rPr>
-        <w:color w:val="FFFFFF" w:themeColor="background1"/>
+        <w:color w:val="000000"/>
       </w:rPr>
       <w:tblPr/>
       <w:tcPr>
@@ -11180,7 +11588,7 @@
     </w:tblStylePr>
     <w:tblStylePr w:type="lastCol">
       <w:rPr>
-        <w:color w:val="FFFFFF" w:themeColor="background1"/>
+        <w:color w:val="000000"/>
       </w:rPr>
       <w:tblPr/>
       <w:tcPr>
@@ -11209,12 +11617,12 @@
     </w:tblStylePr>
     <w:tblStylePr w:type="neCell">
       <w:rPr>
-        <w:color w:val="000000" w:themeColor="text1"/>
+        <w:color w:val="000000"/>
       </w:rPr>
     </w:tblStylePr>
     <w:tblStylePr w:type="nwCell">
       <w:rPr>
-        <w:color w:val="000000" w:themeColor="text1"/>
+        <w:color w:val="000000"/>
       </w:rPr>
     </w:tblStylePr>
   </w:style>
@@ -11227,7 +11635,7 @@
       <w:spacing w:after="0" w:line="240" w:lineRule="auto"/>
     </w:pPr>
     <w:rPr>
-      <w:color w:val="000000" w:themeColor="text1"/>
+      <w:color w:val="000000"/>
     </w:rPr>
     <w:tblPr>
       <w:tblStyleRowBandSize w:val="1"/>
@@ -11273,7 +11681,7 @@
       <w:rPr>
         <w:b/>
         <w:bCs/>
-        <w:color w:val="FFFFFF" w:themeColor="background1"/>
+        <w:color w:val="000000"/>
       </w:rPr>
       <w:tblPr/>
       <w:tcPr>
@@ -11285,7 +11693,7 @@
     </w:tblStylePr>
     <w:tblStylePr w:type="firstCol">
       <w:rPr>
-        <w:color w:val="FFFFFF" w:themeColor="background1"/>
+        <w:color w:val="000000"/>
       </w:rPr>
       <w:tblPr/>
       <w:tcPr>
@@ -11302,7 +11710,7 @@
     </w:tblStylePr>
     <w:tblStylePr w:type="lastCol">
       <w:rPr>
-        <w:color w:val="FFFFFF" w:themeColor="background1"/>
+        <w:color w:val="000000"/>
       </w:rPr>
       <w:tblPr/>
       <w:tcPr>
@@ -11331,12 +11739,12 @@
     </w:tblStylePr>
     <w:tblStylePr w:type="neCell">
       <w:rPr>
-        <w:color w:val="000000" w:themeColor="text1"/>
+        <w:color w:val="000000"/>
       </w:rPr>
     </w:tblStylePr>
     <w:tblStylePr w:type="nwCell">
       <w:rPr>
-        <w:color w:val="000000" w:themeColor="text1"/>
+        <w:color w:val="000000"/>
       </w:rPr>
     </w:tblStylePr>
   </w:style>
@@ -11349,7 +11757,7 @@
       <w:spacing w:after="0" w:line="240" w:lineRule="auto"/>
     </w:pPr>
     <w:rPr>
-      <w:color w:val="000000" w:themeColor="text1"/>
+      <w:color w:val="000000"/>
     </w:rPr>
     <w:tblPr>
       <w:tblStyleRowBandSize w:val="1"/>
@@ -11395,7 +11803,7 @@
       <w:rPr>
         <w:b/>
         <w:bCs/>
-        <w:color w:val="FFFFFF" w:themeColor="background1"/>
+        <w:color w:val="000000"/>
       </w:rPr>
       <w:tblPr/>
       <w:tcPr>
@@ -11407,7 +11815,7 @@
     </w:tblStylePr>
     <w:tblStylePr w:type="firstCol">
       <w:rPr>
-        <w:color w:val="FFFFFF" w:themeColor="background1"/>
+        <w:color w:val="000000"/>
       </w:rPr>
       <w:tblPr/>
       <w:tcPr>
@@ -11424,7 +11832,7 @@
     </w:tblStylePr>
     <w:tblStylePr w:type="lastCol">
       <w:rPr>
-        <w:color w:val="FFFFFF" w:themeColor="background1"/>
+        <w:color w:val="000000"/>
       </w:rPr>
       <w:tblPr/>
       <w:tcPr>
@@ -11453,12 +11861,12 @@
     </w:tblStylePr>
     <w:tblStylePr w:type="neCell">
       <w:rPr>
-        <w:color w:val="000000" w:themeColor="text1"/>
+        <w:color w:val="000000"/>
       </w:rPr>
     </w:tblStylePr>
     <w:tblStylePr w:type="nwCell">
       <w:rPr>
-        <w:color w:val="000000" w:themeColor="text1"/>
+        <w:color w:val="000000"/>
       </w:rPr>
     </w:tblStylePr>
   </w:style>
@@ -11471,7 +11879,7 @@
       <w:spacing w:after="0" w:line="240" w:lineRule="auto"/>
     </w:pPr>
     <w:rPr>
-      <w:color w:val="000000" w:themeColor="text1"/>
+      <w:color w:val="000000"/>
     </w:rPr>
     <w:tblPr>
       <w:tblStyleRowBandSize w:val="1"/>
@@ -11491,7 +11899,7 @@
       <w:rPr>
         <w:b/>
         <w:bCs/>
-        <w:color w:val="FFFFFF" w:themeColor="background1"/>
+        <w:color w:val="000000"/>
       </w:rPr>
       <w:tblPr/>
       <w:tcPr>
@@ -11505,7 +11913,7 @@
       <w:rPr>
         <w:b/>
         <w:bCs/>
-        <w:color w:val="9E3A38" w:themeColor="accent2" w:themeShade="CC"/>
+        <w:color w:val="000000"/>
       </w:rPr>
       <w:tblPr/>
       <w:tcPr>
@@ -11557,7 +11965,7 @@
       <w:spacing w:after="0" w:line="240" w:lineRule="auto"/>
     </w:pPr>
     <w:rPr>
-      <w:color w:val="000000" w:themeColor="text1"/>
+      <w:color w:val="000000"/>
     </w:rPr>
     <w:tblPr>
       <w:tblStyleRowBandSize w:val="1"/>
@@ -11577,7 +11985,7 @@
       <w:rPr>
         <w:b/>
         <w:bCs/>
-        <w:color w:val="FFFFFF" w:themeColor="background1"/>
+        <w:color w:val="000000"/>
       </w:rPr>
       <w:tblPr/>
       <w:tcPr>
@@ -11591,7 +11999,7 @@
       <w:rPr>
         <w:b/>
         <w:bCs/>
-        <w:color w:val="9E3A38" w:themeColor="accent2" w:themeShade="CC"/>
+        <w:color w:val="000000"/>
       </w:rPr>
       <w:tblPr/>
       <w:tcPr>
@@ -11643,7 +12051,7 @@
       <w:spacing w:after="0" w:line="240" w:lineRule="auto"/>
     </w:pPr>
     <w:rPr>
-      <w:color w:val="000000" w:themeColor="text1"/>
+      <w:color w:val="000000"/>
     </w:rPr>
     <w:tblPr>
       <w:tblStyleRowBandSize w:val="1"/>
@@ -11663,7 +12071,7 @@
       <w:rPr>
         <w:b/>
         <w:bCs/>
-        <w:color w:val="FFFFFF" w:themeColor="background1"/>
+        <w:color w:val="000000"/>
       </w:rPr>
       <w:tblPr/>
       <w:tcPr>
@@ -11677,7 +12085,7 @@
       <w:rPr>
         <w:b/>
         <w:bCs/>
-        <w:color w:val="9E3A38" w:themeColor="accent2" w:themeShade="CC"/>
+        <w:color w:val="000000"/>
       </w:rPr>
       <w:tblPr/>
       <w:tcPr>
@@ -11729,7 +12137,7 @@
       <w:spacing w:after="0" w:line="240" w:lineRule="auto"/>
     </w:pPr>
     <w:rPr>
-      <w:color w:val="000000" w:themeColor="text1"/>
+      <w:color w:val="000000"/>
     </w:rPr>
     <w:tblPr>
       <w:tblStyleRowBandSize w:val="1"/>
@@ -11749,7 +12157,7 @@
       <w:rPr>
         <w:b/>
         <w:bCs/>
-        <w:color w:val="FFFFFF" w:themeColor="background1"/>
+        <w:color w:val="000000"/>
       </w:rPr>
       <w:tblPr/>
       <w:tcPr>
@@ -11763,7 +12171,7 @@
       <w:rPr>
         <w:b/>
         <w:bCs/>
-        <w:color w:val="664E82" w:themeColor="accent4" w:themeShade="CC"/>
+        <w:color w:val="000000"/>
       </w:rPr>
       <w:tblPr/>
       <w:tcPr>
@@ -11815,7 +12223,7 @@
       <w:spacing w:after="0" w:line="240" w:lineRule="auto"/>
     </w:pPr>
     <w:rPr>
-      <w:color w:val="000000" w:themeColor="text1"/>
+      <w:color w:val="000000"/>
     </w:rPr>
     <w:tblPr>
       <w:tblStyleRowBandSize w:val="1"/>
@@ -11835,7 +12243,7 @@
       <w:rPr>
         <w:b/>
         <w:bCs/>
-        <w:color w:val="FFFFFF" w:themeColor="background1"/>
+        <w:color w:val="000000"/>
       </w:rPr>
       <w:tblPr/>
       <w:tcPr>
@@ -11849,7 +12257,7 @@
       <w:rPr>
         <w:b/>
         <w:bCs/>
-        <w:color w:val="7E9C40" w:themeColor="accent3" w:themeShade="CC"/>
+        <w:color w:val="000000"/>
       </w:rPr>
       <w:tblPr/>
       <w:tcPr>
@@ -11901,7 +12309,7 @@
       <w:spacing w:after="0" w:line="240" w:lineRule="auto"/>
     </w:pPr>
     <w:rPr>
-      <w:color w:val="000000" w:themeColor="text1"/>
+      <w:color w:val="000000"/>
     </w:rPr>
     <w:tblPr>
       <w:tblStyleRowBandSize w:val="1"/>
@@ -11921,7 +12329,7 @@
       <w:rPr>
         <w:b/>
         <w:bCs/>
-        <w:color w:val="FFFFFF" w:themeColor="background1"/>
+        <w:color w:val="000000"/>
       </w:rPr>
       <w:tblPr/>
       <w:tcPr>
@@ -11935,7 +12343,7 @@
       <w:rPr>
         <w:b/>
         <w:bCs/>
-        <w:color w:val="F2730A" w:themeColor="accent6" w:themeShade="CC"/>
+        <w:color w:val="000000"/>
       </w:rPr>
       <w:tblPr/>
       <w:tcPr>
@@ -11987,7 +12395,7 @@
       <w:spacing w:after="0" w:line="240" w:lineRule="auto"/>
     </w:pPr>
     <w:rPr>
-      <w:color w:val="000000" w:themeColor="text1"/>
+      <w:color w:val="000000"/>
     </w:rPr>
     <w:tblPr>
       <w:tblStyleRowBandSize w:val="1"/>
@@ -12007,7 +12415,7 @@
       <w:rPr>
         <w:b/>
         <w:bCs/>
-        <w:color w:val="FFFFFF" w:themeColor="background1"/>
+        <w:color w:val="000000"/>
       </w:rPr>
       <w:tblPr/>
       <w:tcPr>
@@ -12021,7 +12429,7 @@
       <w:rPr>
         <w:b/>
         <w:bCs/>
-        <w:color w:val="348DA5" w:themeColor="accent5" w:themeShade="CC"/>
+        <w:color w:val="000000"/>
       </w:rPr>
       <w:tblPr/>
       <w:tcPr>
@@ -12073,7 +12481,7 @@
       <w:spacing w:after="0" w:line="240" w:lineRule="auto"/>
     </w:pPr>
     <w:rPr>
-      <w:color w:val="000000" w:themeColor="text1"/>
+      <w:color w:val="000000"/>
     </w:rPr>
     <w:tblPr>
       <w:tblStyleRowBandSize w:val="1"/>
@@ -12106,7 +12514,7 @@
       <w:rPr>
         <w:b/>
         <w:bCs/>
-        <w:color w:val="000000" w:themeColor="text1"/>
+        <w:color w:val="000000"/>
       </w:rPr>
       <w:tblPr/>
       <w:tcPr>
@@ -12115,7 +12523,7 @@
     </w:tblStylePr>
     <w:tblStylePr w:type="firstCol">
       <w:rPr>
-        <w:color w:val="FFFFFF" w:themeColor="background1"/>
+        <w:color w:val="000000"/>
       </w:rPr>
       <w:tblPr/>
       <w:tcPr>
@@ -12124,7 +12532,7 @@
     </w:tblStylePr>
     <w:tblStylePr w:type="lastCol">
       <w:rPr>
-        <w:color w:val="FFFFFF" w:themeColor="background1"/>
+        <w:color w:val="000000"/>
       </w:rPr>
       <w:tblPr/>
       <w:tcPr>
@@ -12153,7 +12561,7 @@
       <w:spacing w:after="0" w:line="240" w:lineRule="auto"/>
     </w:pPr>
     <w:rPr>
-      <w:color w:val="000000" w:themeColor="text1"/>
+      <w:color w:val="000000"/>
     </w:rPr>
     <w:tblPr>
       <w:tblStyleRowBandSize w:val="1"/>
@@ -12186,7 +12594,7 @@
       <w:rPr>
         <w:b/>
         <w:bCs/>
-        <w:color w:val="000000" w:themeColor="text1"/>
+        <w:color w:val="000000"/>
       </w:rPr>
       <w:tblPr/>
       <w:tcPr>
@@ -12195,7 +12603,7 @@
     </w:tblStylePr>
     <w:tblStylePr w:type="firstCol">
       <w:rPr>
-        <w:color w:val="FFFFFF" w:themeColor="background1"/>
+        <w:color w:val="000000"/>
       </w:rPr>
       <w:tblPr/>
       <w:tcPr>
@@ -12204,7 +12612,7 @@
     </w:tblStylePr>
     <w:tblStylePr w:type="lastCol">
       <w:rPr>
-        <w:color w:val="FFFFFF" w:themeColor="background1"/>
+        <w:color w:val="000000"/>
       </w:rPr>
       <w:tblPr/>
       <w:tcPr>
@@ -12233,7 +12641,7 @@
       <w:spacing w:after="0" w:line="240" w:lineRule="auto"/>
     </w:pPr>
     <w:rPr>
-      <w:color w:val="000000" w:themeColor="text1"/>
+      <w:color w:val="000000"/>
     </w:rPr>
     <w:tblPr>
       <w:tblStyleRowBandSize w:val="1"/>
@@ -12266,7 +12674,7 @@
       <w:rPr>
         <w:b/>
         <w:bCs/>
-        <w:color w:val="000000" w:themeColor="text1"/>
+        <w:color w:val="000000"/>
       </w:rPr>
       <w:tblPr/>
       <w:tcPr>
@@ -12275,7 +12683,7 @@
     </w:tblStylePr>
     <w:tblStylePr w:type="firstCol">
       <w:rPr>
-        <w:color w:val="FFFFFF" w:themeColor="background1"/>
+        <w:color w:val="000000"/>
       </w:rPr>
       <w:tblPr/>
       <w:tcPr>
@@ -12284,7 +12692,7 @@
     </w:tblStylePr>
     <w:tblStylePr w:type="lastCol">
       <w:rPr>
-        <w:color w:val="FFFFFF" w:themeColor="background1"/>
+        <w:color w:val="000000"/>
       </w:rPr>
       <w:tblPr/>
       <w:tcPr>
@@ -12313,7 +12721,7 @@
       <w:spacing w:after="0" w:line="240" w:lineRule="auto"/>
     </w:pPr>
     <w:rPr>
-      <w:color w:val="000000" w:themeColor="text1"/>
+      <w:color w:val="000000"/>
     </w:rPr>
     <w:tblPr>
       <w:tblStyleRowBandSize w:val="1"/>
@@ -12346,7 +12754,7 @@
       <w:rPr>
         <w:b/>
         <w:bCs/>
-        <w:color w:val="000000" w:themeColor="text1"/>
+        <w:color w:val="000000"/>
       </w:rPr>
       <w:tblPr/>
       <w:tcPr>
@@ -12355,7 +12763,7 @@
     </w:tblStylePr>
     <w:tblStylePr w:type="firstCol">
       <w:rPr>
-        <w:color w:val="FFFFFF" w:themeColor="background1"/>
+        <w:color w:val="000000"/>
       </w:rPr>
       <w:tblPr/>
       <w:tcPr>
@@ -12364,7 +12772,7 @@
     </w:tblStylePr>
     <w:tblStylePr w:type="lastCol">
       <w:rPr>
-        <w:color w:val="FFFFFF" w:themeColor="background1"/>
+        <w:color w:val="000000"/>
       </w:rPr>
       <w:tblPr/>
       <w:tcPr>
@@ -12393,7 +12801,7 @@
       <w:spacing w:after="0" w:line="240" w:lineRule="auto"/>
     </w:pPr>
     <w:rPr>
-      <w:color w:val="000000" w:themeColor="text1"/>
+      <w:color w:val="000000"/>
     </w:rPr>
     <w:tblPr>
       <w:tblStyleRowBandSize w:val="1"/>
@@ -12426,7 +12834,7 @@
       <w:rPr>
         <w:b/>
         <w:bCs/>
-        <w:color w:val="000000" w:themeColor="text1"/>
+        <w:color w:val="000000"/>
       </w:rPr>
       <w:tblPr/>
       <w:tcPr>
@@ -12435,7 +12843,7 @@
     </w:tblStylePr>
     <w:tblStylePr w:type="firstCol">
       <w:rPr>
-        <w:color w:val="FFFFFF" w:themeColor="background1"/>
+        <w:color w:val="000000"/>
       </w:rPr>
       <w:tblPr/>
       <w:tcPr>
@@ -12444,7 +12852,7 @@
     </w:tblStylePr>
     <w:tblStylePr w:type="lastCol">
       <w:rPr>
-        <w:color w:val="FFFFFF" w:themeColor="background1"/>
+        <w:color w:val="000000"/>
       </w:rPr>
       <w:tblPr/>
       <w:tcPr>
@@ -12473,7 +12881,7 @@
       <w:spacing w:after="0" w:line="240" w:lineRule="auto"/>
     </w:pPr>
     <w:rPr>
-      <w:color w:val="000000" w:themeColor="text1"/>
+      <w:color w:val="000000"/>
     </w:rPr>
     <w:tblPr>
       <w:tblStyleRowBandSize w:val="1"/>
@@ -12506,7 +12914,7 @@
       <w:rPr>
         <w:b/>
         <w:bCs/>
-        <w:color w:val="000000" w:themeColor="text1"/>
+        <w:color w:val="000000"/>
       </w:rPr>
       <w:tblPr/>
       <w:tcPr>
@@ -12515,7 +12923,7 @@
     </w:tblStylePr>
     <w:tblStylePr w:type="firstCol">
       <w:rPr>
-        <w:color w:val="FFFFFF" w:themeColor="background1"/>
+        <w:color w:val="000000"/>
       </w:rPr>
       <w:tblPr/>
       <w:tcPr>
@@ -12524,7 +12932,7 @@
     </w:tblStylePr>
     <w:tblStylePr w:type="lastCol">
       <w:rPr>
-        <w:color w:val="FFFFFF" w:themeColor="background1"/>
+        <w:color w:val="000000"/>
       </w:rPr>
       <w:tblPr/>
       <w:tcPr>
@@ -12553,7 +12961,7 @@
       <w:spacing w:after="0" w:line="240" w:lineRule="auto"/>
     </w:pPr>
     <w:rPr>
-      <w:color w:val="000000" w:themeColor="text1"/>
+      <w:color w:val="000000"/>
     </w:rPr>
     <w:tblPr>
       <w:tblStyleRowBandSize w:val="1"/>
@@ -12586,7 +12994,7 @@
       <w:rPr>
         <w:b/>
         <w:bCs/>
-        <w:color w:val="000000" w:themeColor="text1"/>
+        <w:color w:val="000000"/>
       </w:rPr>
       <w:tblPr/>
       <w:tcPr>
@@ -12595,7 +13003,7 @@
     </w:tblStylePr>
     <w:tblStylePr w:type="firstCol">
       <w:rPr>
-        <w:color w:val="FFFFFF" w:themeColor="background1"/>
+        <w:color w:val="000000"/>
       </w:rPr>
       <w:tblPr/>
       <w:tcPr>
@@ -12604,7 +13012,7 @@
     </w:tblStylePr>
     <w:tblStylePr w:type="lastCol">
       <w:rPr>
-        <w:color w:val="FFFFFF" w:themeColor="background1"/>
+        <w:color w:val="000000"/>
       </w:rPr>
       <w:tblPr/>
       <w:tcPr>

</xml_diff>